<commit_message>
Event Entity PRD v1.1 — add Zoom Webinar integration fields
Adds four system-populated fields supporting the Zoom Integration
Architecture (crmbuilder commit 57caeb7):
- zoomWebinarId
- zoomHostEmail
- attendanceCapturedAt
- zoomLastSyncedAt

Updates virtualMeetingUrl and registrationUrl descriptions to
specify the Zoom integration as the populating system for
Virtual/Hybrid Events. Adds Section 5.4 (Zoom-specific status
visibility), a Zoom Integration layout panel, Implementation
Note 11, and decisions EVT-DEC-011 and EVT-DEC-012.

Both the generator (PRDs/entities/generate-Event-Entity-PRD.js)
and the regenerated docx are committed per the established
generator-driven Entity PRD workflow.

No changes to native fields, relationships, or any
non-Zoom-related content.
</commit_message>
<xml_diff>
--- a/PRDs/entities/Event-Entity-PRD.docx
+++ b/PRDs/entities/Event-Entity-PRD.docx
@@ -309,7 +309,7 @@
                 <w:sz w:val="20"/>
                 <w:szCs w:val="20"/>
               </w:rPr>
-              <w:t xml:space="preserve">1.0</w:t>
+              <w:t xml:space="preserve">1.1</w:t>
             </w:r>
           </w:p>
         </w:tc>
@@ -439,7 +439,7 @@
                 <w:sz w:val="20"/>
                 <w:szCs w:val="20"/>
               </w:rPr>
-              <w:t xml:space="preserve">04-17-26 10:00</w:t>
+              <w:t xml:space="preserve">05-05-26 23:41</w:t>
             </w:r>
           </w:p>
         </w:tc>
@@ -503,7 +503,7 @@
                 <w:sz w:val="20"/>
                 <w:szCs w:val="20"/>
               </w:rPr>
-              <w:t xml:space="preserve">CR Domain PRD v1.0, CR-EVENTS SDO v1.0, CR-EVENTS-MANAGE v1.0, CR-EVENTS-CONVERT v1.0, Entity Inventory v1.4, Contact Entity PRD v1.5, Account Entity PRD v1.5</w:t>
+              <w:t xml:space="preserve">CR Domain PRD v1.0, CR-EVENTS SDO v1.0, CR-EVENTS-MANAGE v1.0, CR-EVENTS-CONVERT v1.0, Entity Inventory v1.4, Contact Entity PRD v1.5, Account Entity PRD v1.5, Zoom Integration Architecture v1.0</w:t>
             </w:r>
           </w:p>
         </w:tc>
@@ -4673,7 +4673,7 @@
                 <w:sz w:val="20"/>
                 <w:szCs w:val="20"/>
               </w:rPr>
-              <w:t xml:space="preserve">Meeting platform URL. Visible via dynamic logic when format is Virtual or Hybrid. Required when format is Virtual or Hybrid and the Event is transitioning to Scheduled. </w:t>
+              <w:t xml:space="preserve">Meeting platform URL. For Events with format = Virtual or Hybrid, this field is system-populated by the Zoom integration bridge service when the Event transitions Draft → Scheduled — set to the Zoom Webinar’s join URL. Visible via dynamic logic when format is Virtual or Hybrid. Required when format is Virtual or Hybrid and the Event is transitioning to Scheduled (the Zoom integration satisfies this requirement automatically; for non-Zoom virtual platforms, the field must be populated manually). </w:t>
             </w:r>
             <w:r>
               <w:rPr>
@@ -4725,7 +4725,33 @@
                 <w:sz w:val="20"/>
                 <w:szCs w:val="20"/>
               </w:rPr>
-              <w:t xml:space="preserve">CR.</w:t>
+              <w:t xml:space="preserve">CR. </w:t>
+            </w:r>
+            <w:r>
+              <w:rPr>
+                <w:rFonts w:ascii="Arial" w:cs="Arial" w:eastAsia="Arial" w:hAnsi="Arial"/>
+                <w:b/>
+                <w:bCs/>
+                <w:i w:val="false"/>
+                <w:iCs w:val="false"/>
+                <w:color w:val="888888"/>
+                <w:sz w:val="20"/>
+                <w:szCs w:val="20"/>
+              </w:rPr>
+              <w:t xml:space="preserve">Implementation: </w:t>
+            </w:r>
+            <w:r>
+              <w:rPr>
+                <w:rFonts w:ascii="Arial" w:cs="Arial" w:eastAsia="Arial" w:hAnsi="Arial"/>
+                <w:b w:val="false"/>
+                <w:bCs w:val="false"/>
+                <w:i w:val="false"/>
+                <w:iCs w:val="false"/>
+                <w:color w:val="888888"/>
+                <w:sz w:val="20"/>
+                <w:szCs w:val="20"/>
+              </w:rPr>
+              <w:t xml:space="preserve">system-populated by Zoom integration when configured; otherwise manually populated. See Zoom Integration Architecture v1.0 §5.1.</w:t>
             </w:r>
           </w:p>
         </w:tc>
@@ -4956,7 +4982,7 @@
                 <w:sz w:val="20"/>
                 <w:szCs w:val="20"/>
               </w:rPr>
-              <w:t xml:space="preserve">Public-facing URL for the registration form. System-populated when the Event transitions from Draft to Scheduled (EVT-DEC-008). Visible via dynamic logic when Event status is not Draft. </w:t>
+              <w:t xml:space="preserve">Public-facing URL for the registration form. For Events with format = Virtual or Hybrid, this field is system-populated by the Zoom integration bridge service when the Event transitions Draft → Scheduled (the Zoom Webinar’s public registration URL). For Events with format = In-Person, the field is system-populated by the CRM-native registration form mechanism on the same transition (EVT-DEC-008). Visible via dynamic logic when Event status is not Draft. </w:t>
             </w:r>
             <w:r>
               <w:rPr>
@@ -5034,7 +5060,7 @@
                 <w:sz w:val="20"/>
                 <w:szCs w:val="20"/>
               </w:rPr>
-              <w:t xml:space="preserve">system-populated, readOnly.</w:t>
+              <w:t xml:space="preserve">system-populated, readOnly. Population source depends on format. See Zoom Integration Architecture v1.0 §5.1.</w:t>
             </w:r>
           </w:p>
         </w:tc>
@@ -6717,6 +6743,1502 @@
       </w:r>
     </w:p>
     <w:p>
+      <w:pPr>
+        <w:pStyle w:val="Heading2"/>
+        <w:spacing w:after="120" w:before="240"/>
+      </w:pPr>
+      <w:r>
+        <w:rPr>
+          <w:rFonts w:ascii="Arial" w:cs="Arial" w:eastAsia="Arial" w:hAnsi="Arial"/>
+          <w:b/>
+          <w:bCs/>
+          <w:i w:val="false"/>
+          <w:iCs w:val="false"/>
+          <w:color w:val="1F3864"/>
+          <w:sz w:val="28"/>
+          <w:szCs w:val="28"/>
+        </w:rPr>
+        <w:t xml:space="preserve">3.5 Zoom Integration</w:t>
+      </w:r>
+    </w:p>
+    <w:p>
+      <w:pPr>
+        <w:spacing w:after="120"/>
+      </w:pPr>
+      <w:r>
+        <w:rPr>
+          <w:rFonts w:ascii="Arial" w:cs="Arial" w:eastAsia="Arial" w:hAnsi="Arial"/>
+          <w:b w:val="false"/>
+          <w:bCs w:val="false"/>
+          <w:i w:val="false"/>
+          <w:iCs w:val="false"/>
+          <w:sz w:val="22"/>
+          <w:szCs w:val="22"/>
+        </w:rPr>
+        <w:t xml:space="preserve">The following fields support automated Zoom Webinar integration for Events with format = Virtual or Hybrid. All four fields are system-populated by the Zoom integration bridge service and are read-only in the CRM UI. Visibility of these fields is driven by format via dynamic logic (Section 5).</w:t>
+      </w:r>
+    </w:p>
+    <w:tbl>
+      <w:tblPr>
+        <w:tblW w:type="dxa" w:w="9360"/>
+        <w:tblBorders>
+          <w:top w:val="single" w:color="auto" w:sz="4"/>
+          <w:left w:val="single" w:color="auto" w:sz="4"/>
+          <w:bottom w:val="single" w:color="auto" w:sz="4"/>
+          <w:right w:val="single" w:color="auto" w:sz="4"/>
+          <w:insideH w:val="single" w:color="auto" w:sz="4"/>
+          <w:insideV w:val="single" w:color="auto" w:sz="4"/>
+        </w:tblBorders>
+      </w:tblPr>
+      <w:tblGrid>
+        <w:gridCol w:w="2200"/>
+        <w:gridCol w:w="1100"/>
+        <w:gridCol w:w="800"/>
+        <w:gridCol w:w="2400"/>
+        <w:gridCol w:w="1000"/>
+        <w:gridCol w:w="1860"/>
+      </w:tblGrid>
+      <w:tr>
+        <w:tc>
+          <w:tcPr>
+            <w:tcW w:type="dxa" w:w="2200"/>
+            <w:tcBorders>
+              <w:top w:val="single" w:color="AAAAAA" w:sz="1"/>
+              <w:left w:val="single" w:color="AAAAAA" w:sz="1"/>
+              <w:bottom w:val="single" w:color="AAAAAA" w:sz="1"/>
+              <w:right w:val="single" w:color="AAAAAA" w:sz="1"/>
+            </w:tcBorders>
+            <w:shd w:fill="1F3864" w:val="clear"/>
+            <w:tcMar>
+              <w:top w:type="dxa" w:w="60"/>
+              <w:left w:type="dxa" w:w="100"/>
+              <w:bottom w:type="dxa" w:w="60"/>
+              <w:right w:type="dxa" w:w="100"/>
+            </w:tcMar>
+          </w:tcPr>
+          <w:p>
+            <w:r>
+              <w:rPr>
+                <w:rFonts w:ascii="Arial" w:cs="Arial" w:eastAsia="Arial" w:hAnsi="Arial"/>
+                <w:b/>
+                <w:bCs/>
+                <w:i w:val="false"/>
+                <w:iCs w:val="false"/>
+                <w:color w:val="FFFFFF"/>
+                <w:sz w:val="20"/>
+                <w:szCs w:val="20"/>
+              </w:rPr>
+              <w:t xml:space="preserve">Field Name</w:t>
+            </w:r>
+          </w:p>
+        </w:tc>
+        <w:tc>
+          <w:tcPr>
+            <w:tcW w:type="dxa" w:w="1100"/>
+            <w:tcBorders>
+              <w:top w:val="single" w:color="AAAAAA" w:sz="1"/>
+              <w:left w:val="single" w:color="AAAAAA" w:sz="1"/>
+              <w:bottom w:val="single" w:color="AAAAAA" w:sz="1"/>
+              <w:right w:val="single" w:color="AAAAAA" w:sz="1"/>
+            </w:tcBorders>
+            <w:shd w:fill="1F3864" w:val="clear"/>
+            <w:tcMar>
+              <w:top w:type="dxa" w:w="60"/>
+              <w:left w:type="dxa" w:w="100"/>
+              <w:bottom w:type="dxa" w:w="60"/>
+              <w:right w:type="dxa" w:w="100"/>
+            </w:tcMar>
+          </w:tcPr>
+          <w:p>
+            <w:r>
+              <w:rPr>
+                <w:rFonts w:ascii="Arial" w:cs="Arial" w:eastAsia="Arial" w:hAnsi="Arial"/>
+                <w:b/>
+                <w:bCs/>
+                <w:i w:val="false"/>
+                <w:iCs w:val="false"/>
+                <w:color w:val="FFFFFF"/>
+                <w:sz w:val="20"/>
+                <w:szCs w:val="20"/>
+              </w:rPr>
+              <w:t xml:space="preserve">Type</w:t>
+            </w:r>
+          </w:p>
+        </w:tc>
+        <w:tc>
+          <w:tcPr>
+            <w:tcW w:type="dxa" w:w="800"/>
+            <w:tcBorders>
+              <w:top w:val="single" w:color="AAAAAA" w:sz="1"/>
+              <w:left w:val="single" w:color="AAAAAA" w:sz="1"/>
+              <w:bottom w:val="single" w:color="AAAAAA" w:sz="1"/>
+              <w:right w:val="single" w:color="AAAAAA" w:sz="1"/>
+            </w:tcBorders>
+            <w:shd w:fill="1F3864" w:val="clear"/>
+            <w:tcMar>
+              <w:top w:type="dxa" w:w="60"/>
+              <w:left w:type="dxa" w:w="100"/>
+              <w:bottom w:type="dxa" w:w="60"/>
+              <w:right w:type="dxa" w:w="100"/>
+            </w:tcMar>
+          </w:tcPr>
+          <w:p>
+            <w:r>
+              <w:rPr>
+                <w:rFonts w:ascii="Arial" w:cs="Arial" w:eastAsia="Arial" w:hAnsi="Arial"/>
+                <w:b/>
+                <w:bCs/>
+                <w:i w:val="false"/>
+                <w:iCs w:val="false"/>
+                <w:color w:val="FFFFFF"/>
+                <w:sz w:val="20"/>
+                <w:szCs w:val="20"/>
+              </w:rPr>
+              <w:t xml:space="preserve">Required</w:t>
+            </w:r>
+          </w:p>
+        </w:tc>
+        <w:tc>
+          <w:tcPr>
+            <w:tcW w:type="dxa" w:w="2400"/>
+            <w:tcBorders>
+              <w:top w:val="single" w:color="AAAAAA" w:sz="1"/>
+              <w:left w:val="single" w:color="AAAAAA" w:sz="1"/>
+              <w:bottom w:val="single" w:color="AAAAAA" w:sz="1"/>
+              <w:right w:val="single" w:color="AAAAAA" w:sz="1"/>
+            </w:tcBorders>
+            <w:shd w:fill="1F3864" w:val="clear"/>
+            <w:tcMar>
+              <w:top w:type="dxa" w:w="60"/>
+              <w:left w:type="dxa" w:w="100"/>
+              <w:bottom w:type="dxa" w:w="60"/>
+              <w:right w:type="dxa" w:w="100"/>
+            </w:tcMar>
+          </w:tcPr>
+          <w:p>
+            <w:r>
+              <w:rPr>
+                <w:rFonts w:ascii="Arial" w:cs="Arial" w:eastAsia="Arial" w:hAnsi="Arial"/>
+                <w:b/>
+                <w:bCs/>
+                <w:i w:val="false"/>
+                <w:iCs w:val="false"/>
+                <w:color w:val="FFFFFF"/>
+                <w:sz w:val="20"/>
+                <w:szCs w:val="20"/>
+              </w:rPr>
+              <w:t xml:space="preserve">Values</w:t>
+            </w:r>
+          </w:p>
+        </w:tc>
+        <w:tc>
+          <w:tcPr>
+            <w:tcW w:type="dxa" w:w="1000"/>
+            <w:tcBorders>
+              <w:top w:val="single" w:color="AAAAAA" w:sz="1"/>
+              <w:left w:val="single" w:color="AAAAAA" w:sz="1"/>
+              <w:bottom w:val="single" w:color="AAAAAA" w:sz="1"/>
+              <w:right w:val="single" w:color="AAAAAA" w:sz="1"/>
+            </w:tcBorders>
+            <w:shd w:fill="1F3864" w:val="clear"/>
+            <w:tcMar>
+              <w:top w:type="dxa" w:w="60"/>
+              <w:left w:type="dxa" w:w="100"/>
+              <w:bottom w:type="dxa" w:w="60"/>
+              <w:right w:type="dxa" w:w="100"/>
+            </w:tcMar>
+          </w:tcPr>
+          <w:p>
+            <w:r>
+              <w:rPr>
+                <w:rFonts w:ascii="Arial" w:cs="Arial" w:eastAsia="Arial" w:hAnsi="Arial"/>
+                <w:b/>
+                <w:bCs/>
+                <w:i w:val="false"/>
+                <w:iCs w:val="false"/>
+                <w:color w:val="FFFFFF"/>
+                <w:sz w:val="20"/>
+                <w:szCs w:val="20"/>
+              </w:rPr>
+              <w:t xml:space="preserve">Default</w:t>
+            </w:r>
+          </w:p>
+        </w:tc>
+        <w:tc>
+          <w:tcPr>
+            <w:tcW w:type="dxa" w:w="1860"/>
+            <w:tcBorders>
+              <w:top w:val="single" w:color="AAAAAA" w:sz="1"/>
+              <w:left w:val="single" w:color="AAAAAA" w:sz="1"/>
+              <w:bottom w:val="single" w:color="AAAAAA" w:sz="1"/>
+              <w:right w:val="single" w:color="AAAAAA" w:sz="1"/>
+            </w:tcBorders>
+            <w:shd w:fill="1F3864" w:val="clear"/>
+            <w:tcMar>
+              <w:top w:type="dxa" w:w="60"/>
+              <w:left w:type="dxa" w:w="100"/>
+              <w:bottom w:type="dxa" w:w="60"/>
+              <w:right w:type="dxa" w:w="100"/>
+            </w:tcMar>
+          </w:tcPr>
+          <w:p>
+            <w:r>
+              <w:rPr>
+                <w:rFonts w:ascii="Arial" w:cs="Arial" w:eastAsia="Arial" w:hAnsi="Arial"/>
+                <w:b/>
+                <w:bCs/>
+                <w:i w:val="false"/>
+                <w:iCs w:val="false"/>
+                <w:color w:val="FFFFFF"/>
+                <w:sz w:val="20"/>
+                <w:szCs w:val="20"/>
+              </w:rPr>
+              <w:t xml:space="preserve">ID</w:t>
+            </w:r>
+          </w:p>
+        </w:tc>
+      </w:tr>
+      <w:tr>
+        <w:tc>
+          <w:tcPr>
+            <w:tcW w:type="dxa" w:w="2200"/>
+            <w:tcBorders>
+              <w:top w:val="single" w:color="AAAAAA" w:sz="1"/>
+              <w:left w:val="single" w:color="AAAAAA" w:sz="1"/>
+              <w:bottom w:val="single" w:color="AAAAAA" w:sz="1"/>
+              <w:right w:val="single" w:color="AAAAAA" w:sz="1"/>
+            </w:tcBorders>
+            <w:tcMar>
+              <w:top w:type="dxa" w:w="60"/>
+              <w:left w:type="dxa" w:w="100"/>
+              <w:bottom w:type="dxa" w:w="60"/>
+              <w:right w:type="dxa" w:w="100"/>
+            </w:tcMar>
+          </w:tcPr>
+          <w:p>
+            <w:r>
+              <w:rPr>
+                <w:rFonts w:ascii="Arial" w:cs="Arial" w:eastAsia="Arial" w:hAnsi="Arial"/>
+                <w:b/>
+                <w:bCs/>
+                <w:i w:val="false"/>
+                <w:iCs w:val="false"/>
+                <w:sz w:val="20"/>
+                <w:szCs w:val="20"/>
+              </w:rPr>
+              <w:t xml:space="preserve">zoomWebinarId</w:t>
+            </w:r>
+          </w:p>
+        </w:tc>
+        <w:tc>
+          <w:tcPr>
+            <w:tcW w:type="dxa" w:w="1100"/>
+            <w:tcBorders>
+              <w:top w:val="single" w:color="AAAAAA" w:sz="1"/>
+              <w:left w:val="single" w:color="AAAAAA" w:sz="1"/>
+              <w:bottom w:val="single" w:color="AAAAAA" w:sz="1"/>
+              <w:right w:val="single" w:color="AAAAAA" w:sz="1"/>
+            </w:tcBorders>
+            <w:tcMar>
+              <w:top w:type="dxa" w:w="60"/>
+              <w:left w:type="dxa" w:w="100"/>
+              <w:bottom w:type="dxa" w:w="60"/>
+              <w:right w:type="dxa" w:w="100"/>
+            </w:tcMar>
+          </w:tcPr>
+          <w:p>
+            <w:r>
+              <w:rPr>
+                <w:rFonts w:ascii="Arial" w:cs="Arial" w:eastAsia="Arial" w:hAnsi="Arial"/>
+                <w:b w:val="false"/>
+                <w:bCs w:val="false"/>
+                <w:i w:val="false"/>
+                <w:iCs w:val="false"/>
+                <w:sz w:val="20"/>
+                <w:szCs w:val="20"/>
+              </w:rPr>
+              <w:t xml:space="preserve">varchar</w:t>
+            </w:r>
+          </w:p>
+        </w:tc>
+        <w:tc>
+          <w:tcPr>
+            <w:tcW w:type="dxa" w:w="800"/>
+            <w:tcBorders>
+              <w:top w:val="single" w:color="AAAAAA" w:sz="1"/>
+              <w:left w:val="single" w:color="AAAAAA" w:sz="1"/>
+              <w:bottom w:val="single" w:color="AAAAAA" w:sz="1"/>
+              <w:right w:val="single" w:color="AAAAAA" w:sz="1"/>
+            </w:tcBorders>
+            <w:tcMar>
+              <w:top w:type="dxa" w:w="60"/>
+              <w:left w:type="dxa" w:w="100"/>
+              <w:bottom w:type="dxa" w:w="60"/>
+              <w:right w:type="dxa" w:w="100"/>
+            </w:tcMar>
+          </w:tcPr>
+          <w:p>
+            <w:r>
+              <w:rPr>
+                <w:rFonts w:ascii="Arial" w:cs="Arial" w:eastAsia="Arial" w:hAnsi="Arial"/>
+                <w:b w:val="false"/>
+                <w:bCs w:val="false"/>
+                <w:i w:val="false"/>
+                <w:iCs w:val="false"/>
+                <w:sz w:val="20"/>
+                <w:szCs w:val="20"/>
+              </w:rPr>
+              <w:t xml:space="preserve">No</w:t>
+            </w:r>
+          </w:p>
+        </w:tc>
+        <w:tc>
+          <w:tcPr>
+            <w:tcW w:type="dxa" w:w="2400"/>
+            <w:tcBorders>
+              <w:top w:val="single" w:color="AAAAAA" w:sz="1"/>
+              <w:left w:val="single" w:color="AAAAAA" w:sz="1"/>
+              <w:bottom w:val="single" w:color="AAAAAA" w:sz="1"/>
+              <w:right w:val="single" w:color="AAAAAA" w:sz="1"/>
+            </w:tcBorders>
+            <w:tcMar>
+              <w:top w:type="dxa" w:w="60"/>
+              <w:left w:type="dxa" w:w="100"/>
+              <w:bottom w:type="dxa" w:w="60"/>
+              <w:right w:type="dxa" w:w="100"/>
+            </w:tcMar>
+          </w:tcPr>
+          <w:p>
+            <w:r>
+              <w:rPr>
+                <w:rFonts w:ascii="Arial" w:cs="Arial" w:eastAsia="Arial" w:hAnsi="Arial"/>
+                <w:b w:val="false"/>
+                <w:bCs w:val="false"/>
+                <w:i w:val="false"/>
+                <w:iCs w:val="false"/>
+                <w:sz w:val="20"/>
+                <w:szCs w:val="20"/>
+              </w:rPr>
+              <w:t xml:space="preserve">—</w:t>
+            </w:r>
+          </w:p>
+        </w:tc>
+        <w:tc>
+          <w:tcPr>
+            <w:tcW w:type="dxa" w:w="1000"/>
+            <w:tcBorders>
+              <w:top w:val="single" w:color="AAAAAA" w:sz="1"/>
+              <w:left w:val="single" w:color="AAAAAA" w:sz="1"/>
+              <w:bottom w:val="single" w:color="AAAAAA" w:sz="1"/>
+              <w:right w:val="single" w:color="AAAAAA" w:sz="1"/>
+            </w:tcBorders>
+            <w:tcMar>
+              <w:top w:type="dxa" w:w="60"/>
+              <w:left w:type="dxa" w:w="100"/>
+              <w:bottom w:type="dxa" w:w="60"/>
+              <w:right w:type="dxa" w:w="100"/>
+            </w:tcMar>
+          </w:tcPr>
+          <w:p>
+            <w:r>
+              <w:rPr>
+                <w:rFonts w:ascii="Arial" w:cs="Arial" w:eastAsia="Arial" w:hAnsi="Arial"/>
+                <w:b w:val="false"/>
+                <w:bCs w:val="false"/>
+                <w:i w:val="false"/>
+                <w:iCs w:val="false"/>
+                <w:sz w:val="20"/>
+                <w:szCs w:val="20"/>
+              </w:rPr>
+              <w:t xml:space="preserve">—</w:t>
+            </w:r>
+          </w:p>
+        </w:tc>
+        <w:tc>
+          <w:tcPr>
+            <w:tcW w:type="dxa" w:w="1860"/>
+            <w:tcBorders>
+              <w:top w:val="single" w:color="AAAAAA" w:sz="1"/>
+              <w:left w:val="single" w:color="AAAAAA" w:sz="1"/>
+              <w:bottom w:val="single" w:color="AAAAAA" w:sz="1"/>
+              <w:right w:val="single" w:color="AAAAAA" w:sz="1"/>
+            </w:tcBorders>
+            <w:tcMar>
+              <w:top w:type="dxa" w:w="60"/>
+              <w:left w:type="dxa" w:w="100"/>
+              <w:bottom w:type="dxa" w:w="60"/>
+              <w:right w:type="dxa" w:w="100"/>
+            </w:tcMar>
+          </w:tcPr>
+          <w:p>
+            <w:r>
+              <w:rPr>
+                <w:rFonts w:ascii="Arial" w:cs="Arial" w:eastAsia="Arial" w:hAnsi="Arial"/>
+                <w:b w:val="false"/>
+                <w:bCs w:val="false"/>
+                <w:i w:val="false"/>
+                <w:iCs w:val="false"/>
+                <w:color w:val="888888"/>
+                <w:sz w:val="16"/>
+                <w:szCs w:val="16"/>
+              </w:rPr>
+              <w:t xml:space="preserve">CR-EVENTS-MANAGE-DAT-034</w:t>
+            </w:r>
+          </w:p>
+        </w:tc>
+      </w:tr>
+      <w:tr>
+        <w:tc>
+          <w:tcPr>
+            <w:tcW w:type="dxa" w:w="9360"/>
+            <w:gridSpan w:val="6"/>
+            <w:tcBorders>
+              <w:top w:val="single" w:color="AAAAAA" w:sz="1"/>
+              <w:left w:val="single" w:color="AAAAAA" w:sz="1"/>
+              <w:bottom w:val="single" w:color="AAAAAA" w:sz="1"/>
+              <w:right w:val="single" w:color="AAAAAA" w:sz="1"/>
+            </w:tcBorders>
+            <w:tcMar>
+              <w:top w:type="dxa" w:w="40"/>
+              <w:left w:type="dxa" w:w="100"/>
+              <w:bottom w:type="dxa" w:w="80"/>
+              <w:right w:type="dxa" w:w="100"/>
+            </w:tcMar>
+          </w:tcPr>
+          <w:p>
+            <w:r>
+              <w:rPr>
+                <w:rFonts w:ascii="Arial" w:cs="Arial" w:eastAsia="Arial" w:hAnsi="Arial"/>
+                <w:b w:val="false"/>
+                <w:bCs w:val="false"/>
+                <w:i w:val="false"/>
+                <w:iCs w:val="false"/>
+                <w:color w:val="888888"/>
+                <w:sz w:val="20"/>
+                <w:szCs w:val="20"/>
+              </w:rPr>
+              <w:t xml:space="preserve">The Zoom-side Webinar ID, system-populated by the Zoom integration bridge service when the Event transitions Draft → Scheduled. Empty for Events with format = In-Person or for Events still in Draft. Read-only after population. </w:t>
+            </w:r>
+            <w:r>
+              <w:rPr>
+                <w:rFonts w:ascii="Arial" w:cs="Arial" w:eastAsia="Arial" w:hAnsi="Arial"/>
+                <w:b/>
+                <w:bCs/>
+                <w:i w:val="false"/>
+                <w:iCs w:val="false"/>
+                <w:color w:val="888888"/>
+                <w:sz w:val="20"/>
+                <w:szCs w:val="20"/>
+              </w:rPr>
+              <w:t xml:space="preserve">Visibility: </w:t>
+            </w:r>
+            <w:r>
+              <w:rPr>
+                <w:rFonts w:ascii="Arial" w:cs="Arial" w:eastAsia="Arial" w:hAnsi="Arial"/>
+                <w:b w:val="false"/>
+                <w:bCs w:val="false"/>
+                <w:i w:val="false"/>
+                <w:iCs w:val="false"/>
+                <w:color w:val="888888"/>
+                <w:sz w:val="20"/>
+                <w:szCs w:val="20"/>
+              </w:rPr>
+              <w:t xml:space="preserve">format = Virtual or Hybrid AND status ≠ Draft. </w:t>
+            </w:r>
+            <w:r>
+              <w:rPr>
+                <w:rFonts w:ascii="Arial" w:cs="Arial" w:eastAsia="Arial" w:hAnsi="Arial"/>
+                <w:b/>
+                <w:bCs/>
+                <w:i w:val="false"/>
+                <w:iCs w:val="false"/>
+                <w:color w:val="888888"/>
+                <w:sz w:val="20"/>
+                <w:szCs w:val="20"/>
+              </w:rPr>
+              <w:t xml:space="preserve">Domains: </w:t>
+            </w:r>
+            <w:r>
+              <w:rPr>
+                <w:rFonts w:ascii="Arial" w:cs="Arial" w:eastAsia="Arial" w:hAnsi="Arial"/>
+                <w:b w:val="false"/>
+                <w:bCs w:val="false"/>
+                <w:i w:val="false"/>
+                <w:iCs w:val="false"/>
+                <w:color w:val="888888"/>
+                <w:sz w:val="20"/>
+                <w:szCs w:val="20"/>
+              </w:rPr>
+              <w:t xml:space="preserve">CR. </w:t>
+            </w:r>
+            <w:r>
+              <w:rPr>
+                <w:rFonts w:ascii="Arial" w:cs="Arial" w:eastAsia="Arial" w:hAnsi="Arial"/>
+                <w:b/>
+                <w:bCs/>
+                <w:i w:val="false"/>
+                <w:iCs w:val="false"/>
+                <w:color w:val="888888"/>
+                <w:sz w:val="20"/>
+                <w:szCs w:val="20"/>
+              </w:rPr>
+              <w:t xml:space="preserve">Implementation: </w:t>
+            </w:r>
+            <w:r>
+              <w:rPr>
+                <w:rFonts w:ascii="Arial" w:cs="Arial" w:eastAsia="Arial" w:hAnsi="Arial"/>
+                <w:b w:val="false"/>
+                <w:bCs w:val="false"/>
+                <w:i w:val="false"/>
+                <w:iCs w:val="false"/>
+                <w:color w:val="888888"/>
+                <w:sz w:val="20"/>
+                <w:szCs w:val="20"/>
+              </w:rPr>
+              <w:t xml:space="preserve">system-populated, readOnly. See Zoom Integration Architecture v1.0 §5.1.</w:t>
+            </w:r>
+          </w:p>
+        </w:tc>
+      </w:tr>
+      <w:tr>
+        <w:tc>
+          <w:tcPr>
+            <w:tcW w:type="dxa" w:w="2200"/>
+            <w:tcBorders>
+              <w:top w:val="single" w:color="AAAAAA" w:sz="1"/>
+              <w:left w:val="single" w:color="AAAAAA" w:sz="1"/>
+              <w:bottom w:val="single" w:color="AAAAAA" w:sz="1"/>
+              <w:right w:val="single" w:color="AAAAAA" w:sz="1"/>
+            </w:tcBorders>
+            <w:shd w:fill="F2F7FB" w:val="clear"/>
+            <w:tcMar>
+              <w:top w:type="dxa" w:w="60"/>
+              <w:left w:type="dxa" w:w="100"/>
+              <w:bottom w:type="dxa" w:w="60"/>
+              <w:right w:type="dxa" w:w="100"/>
+            </w:tcMar>
+          </w:tcPr>
+          <w:p>
+            <w:r>
+              <w:rPr>
+                <w:rFonts w:ascii="Arial" w:cs="Arial" w:eastAsia="Arial" w:hAnsi="Arial"/>
+                <w:b/>
+                <w:bCs/>
+                <w:i w:val="false"/>
+                <w:iCs w:val="false"/>
+                <w:sz w:val="20"/>
+                <w:szCs w:val="20"/>
+              </w:rPr>
+              <w:t xml:space="preserve">zoomHostEmail</w:t>
+            </w:r>
+          </w:p>
+        </w:tc>
+        <w:tc>
+          <w:tcPr>
+            <w:tcW w:type="dxa" w:w="1100"/>
+            <w:tcBorders>
+              <w:top w:val="single" w:color="AAAAAA" w:sz="1"/>
+              <w:left w:val="single" w:color="AAAAAA" w:sz="1"/>
+              <w:bottom w:val="single" w:color="AAAAAA" w:sz="1"/>
+              <w:right w:val="single" w:color="AAAAAA" w:sz="1"/>
+            </w:tcBorders>
+            <w:shd w:fill="F2F7FB" w:val="clear"/>
+            <w:tcMar>
+              <w:top w:type="dxa" w:w="60"/>
+              <w:left w:type="dxa" w:w="100"/>
+              <w:bottom w:type="dxa" w:w="60"/>
+              <w:right w:type="dxa" w:w="100"/>
+            </w:tcMar>
+          </w:tcPr>
+          <w:p>
+            <w:r>
+              <w:rPr>
+                <w:rFonts w:ascii="Arial" w:cs="Arial" w:eastAsia="Arial" w:hAnsi="Arial"/>
+                <w:b w:val="false"/>
+                <w:bCs w:val="false"/>
+                <w:i w:val="false"/>
+                <w:iCs w:val="false"/>
+                <w:sz w:val="20"/>
+                <w:szCs w:val="20"/>
+              </w:rPr>
+              <w:t xml:space="preserve">varchar</w:t>
+            </w:r>
+          </w:p>
+        </w:tc>
+        <w:tc>
+          <w:tcPr>
+            <w:tcW w:type="dxa" w:w="800"/>
+            <w:tcBorders>
+              <w:top w:val="single" w:color="AAAAAA" w:sz="1"/>
+              <w:left w:val="single" w:color="AAAAAA" w:sz="1"/>
+              <w:bottom w:val="single" w:color="AAAAAA" w:sz="1"/>
+              <w:right w:val="single" w:color="AAAAAA" w:sz="1"/>
+            </w:tcBorders>
+            <w:shd w:fill="F2F7FB" w:val="clear"/>
+            <w:tcMar>
+              <w:top w:type="dxa" w:w="60"/>
+              <w:left w:type="dxa" w:w="100"/>
+              <w:bottom w:type="dxa" w:w="60"/>
+              <w:right w:type="dxa" w:w="100"/>
+            </w:tcMar>
+          </w:tcPr>
+          <w:p>
+            <w:r>
+              <w:rPr>
+                <w:rFonts w:ascii="Arial" w:cs="Arial" w:eastAsia="Arial" w:hAnsi="Arial"/>
+                <w:b w:val="false"/>
+                <w:bCs w:val="false"/>
+                <w:i w:val="false"/>
+                <w:iCs w:val="false"/>
+                <w:sz w:val="20"/>
+                <w:szCs w:val="20"/>
+              </w:rPr>
+              <w:t xml:space="preserve">No</w:t>
+            </w:r>
+          </w:p>
+        </w:tc>
+        <w:tc>
+          <w:tcPr>
+            <w:tcW w:type="dxa" w:w="2400"/>
+            <w:tcBorders>
+              <w:top w:val="single" w:color="AAAAAA" w:sz="1"/>
+              <w:left w:val="single" w:color="AAAAAA" w:sz="1"/>
+              <w:bottom w:val="single" w:color="AAAAAA" w:sz="1"/>
+              <w:right w:val="single" w:color="AAAAAA" w:sz="1"/>
+            </w:tcBorders>
+            <w:shd w:fill="F2F7FB" w:val="clear"/>
+            <w:tcMar>
+              <w:top w:type="dxa" w:w="60"/>
+              <w:left w:type="dxa" w:w="100"/>
+              <w:bottom w:type="dxa" w:w="60"/>
+              <w:right w:type="dxa" w:w="100"/>
+            </w:tcMar>
+          </w:tcPr>
+          <w:p>
+            <w:r>
+              <w:rPr>
+                <w:rFonts w:ascii="Arial" w:cs="Arial" w:eastAsia="Arial" w:hAnsi="Arial"/>
+                <w:b w:val="false"/>
+                <w:bCs w:val="false"/>
+                <w:i w:val="false"/>
+                <w:iCs w:val="false"/>
+                <w:sz w:val="20"/>
+                <w:szCs w:val="20"/>
+              </w:rPr>
+              <w:t xml:space="preserve">—</w:t>
+            </w:r>
+          </w:p>
+        </w:tc>
+        <w:tc>
+          <w:tcPr>
+            <w:tcW w:type="dxa" w:w="1000"/>
+            <w:tcBorders>
+              <w:top w:val="single" w:color="AAAAAA" w:sz="1"/>
+              <w:left w:val="single" w:color="AAAAAA" w:sz="1"/>
+              <w:bottom w:val="single" w:color="AAAAAA" w:sz="1"/>
+              <w:right w:val="single" w:color="AAAAAA" w:sz="1"/>
+            </w:tcBorders>
+            <w:shd w:fill="F2F7FB" w:val="clear"/>
+            <w:tcMar>
+              <w:top w:type="dxa" w:w="60"/>
+              <w:left w:type="dxa" w:w="100"/>
+              <w:bottom w:type="dxa" w:w="60"/>
+              <w:right w:type="dxa" w:w="100"/>
+            </w:tcMar>
+          </w:tcPr>
+          <w:p>
+            <w:r>
+              <w:rPr>
+                <w:rFonts w:ascii="Arial" w:cs="Arial" w:eastAsia="Arial" w:hAnsi="Arial"/>
+                <w:b w:val="false"/>
+                <w:bCs w:val="false"/>
+                <w:i w:val="false"/>
+                <w:iCs w:val="false"/>
+                <w:sz w:val="20"/>
+                <w:szCs w:val="20"/>
+              </w:rPr>
+              <w:t xml:space="preserve">—</w:t>
+            </w:r>
+          </w:p>
+        </w:tc>
+        <w:tc>
+          <w:tcPr>
+            <w:tcW w:type="dxa" w:w="1860"/>
+            <w:tcBorders>
+              <w:top w:val="single" w:color="AAAAAA" w:sz="1"/>
+              <w:left w:val="single" w:color="AAAAAA" w:sz="1"/>
+              <w:bottom w:val="single" w:color="AAAAAA" w:sz="1"/>
+              <w:right w:val="single" w:color="AAAAAA" w:sz="1"/>
+            </w:tcBorders>
+            <w:shd w:fill="F2F7FB" w:val="clear"/>
+            <w:tcMar>
+              <w:top w:type="dxa" w:w="60"/>
+              <w:left w:type="dxa" w:w="100"/>
+              <w:bottom w:type="dxa" w:w="60"/>
+              <w:right w:type="dxa" w:w="100"/>
+            </w:tcMar>
+          </w:tcPr>
+          <w:p>
+            <w:r>
+              <w:rPr>
+                <w:rFonts w:ascii="Arial" w:cs="Arial" w:eastAsia="Arial" w:hAnsi="Arial"/>
+                <w:b w:val="false"/>
+                <w:bCs w:val="false"/>
+                <w:i w:val="false"/>
+                <w:iCs w:val="false"/>
+                <w:color w:val="888888"/>
+                <w:sz w:val="16"/>
+                <w:szCs w:val="16"/>
+              </w:rPr>
+              <w:t xml:space="preserve">CR-EVENTS-MANAGE-DAT-035</w:t>
+            </w:r>
+          </w:p>
+        </w:tc>
+      </w:tr>
+      <w:tr>
+        <w:tc>
+          <w:tcPr>
+            <w:tcW w:type="dxa" w:w="9360"/>
+            <w:gridSpan w:val="6"/>
+            <w:tcBorders>
+              <w:top w:val="single" w:color="AAAAAA" w:sz="1"/>
+              <w:left w:val="single" w:color="AAAAAA" w:sz="1"/>
+              <w:bottom w:val="single" w:color="AAAAAA" w:sz="1"/>
+              <w:right w:val="single" w:color="AAAAAA" w:sz="1"/>
+            </w:tcBorders>
+            <w:shd w:fill="F2F7FB" w:val="clear"/>
+            <w:tcMar>
+              <w:top w:type="dxa" w:w="40"/>
+              <w:left w:type="dxa" w:w="100"/>
+              <w:bottom w:type="dxa" w:w="80"/>
+              <w:right w:type="dxa" w:w="100"/>
+            </w:tcMar>
+          </w:tcPr>
+          <w:p>
+            <w:r>
+              <w:rPr>
+                <w:rFonts w:ascii="Arial" w:cs="Arial" w:eastAsia="Arial" w:hAnsi="Arial"/>
+                <w:b w:val="false"/>
+                <w:bCs w:val="false"/>
+                <w:i w:val="false"/>
+                <w:iCs w:val="false"/>
+                <w:color w:val="888888"/>
+                <w:sz w:val="20"/>
+                <w:szCs w:val="20"/>
+              </w:rPr>
+              <w:t xml:space="preserve">The Zoom user under whose account the Webinar was created, system-populated by the Zoom integration bridge service from connector configuration. All Webinars are hosted by a single configured Zoom user regardless of which CRM coordinator created the Event. Read-only. </w:t>
+            </w:r>
+            <w:r>
+              <w:rPr>
+                <w:rFonts w:ascii="Arial" w:cs="Arial" w:eastAsia="Arial" w:hAnsi="Arial"/>
+                <w:b/>
+                <w:bCs/>
+                <w:i w:val="false"/>
+                <w:iCs w:val="false"/>
+                <w:color w:val="888888"/>
+                <w:sz w:val="20"/>
+                <w:szCs w:val="20"/>
+              </w:rPr>
+              <w:t xml:space="preserve">Visibility: </w:t>
+            </w:r>
+            <w:r>
+              <w:rPr>
+                <w:rFonts w:ascii="Arial" w:cs="Arial" w:eastAsia="Arial" w:hAnsi="Arial"/>
+                <w:b w:val="false"/>
+                <w:bCs w:val="false"/>
+                <w:i w:val="false"/>
+                <w:iCs w:val="false"/>
+                <w:color w:val="888888"/>
+                <w:sz w:val="20"/>
+                <w:szCs w:val="20"/>
+              </w:rPr>
+              <w:t xml:space="preserve">format = Virtual or Hybrid AND status ≠ Draft. </w:t>
+            </w:r>
+            <w:r>
+              <w:rPr>
+                <w:rFonts w:ascii="Arial" w:cs="Arial" w:eastAsia="Arial" w:hAnsi="Arial"/>
+                <w:b/>
+                <w:bCs/>
+                <w:i w:val="false"/>
+                <w:iCs w:val="false"/>
+                <w:color w:val="888888"/>
+                <w:sz w:val="20"/>
+                <w:szCs w:val="20"/>
+              </w:rPr>
+              <w:t xml:space="preserve">Domains: </w:t>
+            </w:r>
+            <w:r>
+              <w:rPr>
+                <w:rFonts w:ascii="Arial" w:cs="Arial" w:eastAsia="Arial" w:hAnsi="Arial"/>
+                <w:b w:val="false"/>
+                <w:bCs w:val="false"/>
+                <w:i w:val="false"/>
+                <w:iCs w:val="false"/>
+                <w:color w:val="888888"/>
+                <w:sz w:val="20"/>
+                <w:szCs w:val="20"/>
+              </w:rPr>
+              <w:t xml:space="preserve">CR. </w:t>
+            </w:r>
+            <w:r>
+              <w:rPr>
+                <w:rFonts w:ascii="Arial" w:cs="Arial" w:eastAsia="Arial" w:hAnsi="Arial"/>
+                <w:b/>
+                <w:bCs/>
+                <w:i w:val="false"/>
+                <w:iCs w:val="false"/>
+                <w:color w:val="888888"/>
+                <w:sz w:val="20"/>
+                <w:szCs w:val="20"/>
+              </w:rPr>
+              <w:t xml:space="preserve">Implementation: </w:t>
+            </w:r>
+            <w:r>
+              <w:rPr>
+                <w:rFonts w:ascii="Arial" w:cs="Arial" w:eastAsia="Arial" w:hAnsi="Arial"/>
+                <w:b w:val="false"/>
+                <w:bCs w:val="false"/>
+                <w:i w:val="false"/>
+                <w:iCs w:val="false"/>
+                <w:color w:val="888888"/>
+                <w:sz w:val="20"/>
+                <w:szCs w:val="20"/>
+              </w:rPr>
+              <w:t xml:space="preserve">system-populated, readOnly.</w:t>
+            </w:r>
+          </w:p>
+        </w:tc>
+      </w:tr>
+      <w:tr>
+        <w:tc>
+          <w:tcPr>
+            <w:tcW w:type="dxa" w:w="2200"/>
+            <w:tcBorders>
+              <w:top w:val="single" w:color="AAAAAA" w:sz="1"/>
+              <w:left w:val="single" w:color="AAAAAA" w:sz="1"/>
+              <w:bottom w:val="single" w:color="AAAAAA" w:sz="1"/>
+              <w:right w:val="single" w:color="AAAAAA" w:sz="1"/>
+            </w:tcBorders>
+            <w:tcMar>
+              <w:top w:type="dxa" w:w="60"/>
+              <w:left w:type="dxa" w:w="100"/>
+              <w:bottom w:type="dxa" w:w="60"/>
+              <w:right w:type="dxa" w:w="100"/>
+            </w:tcMar>
+          </w:tcPr>
+          <w:p>
+            <w:r>
+              <w:rPr>
+                <w:rFonts w:ascii="Arial" w:cs="Arial" w:eastAsia="Arial" w:hAnsi="Arial"/>
+                <w:b/>
+                <w:bCs/>
+                <w:i w:val="false"/>
+                <w:iCs w:val="false"/>
+                <w:sz w:val="20"/>
+                <w:szCs w:val="20"/>
+              </w:rPr>
+              <w:t xml:space="preserve">attendanceCapturedAt</w:t>
+            </w:r>
+          </w:p>
+        </w:tc>
+        <w:tc>
+          <w:tcPr>
+            <w:tcW w:type="dxa" w:w="1100"/>
+            <w:tcBorders>
+              <w:top w:val="single" w:color="AAAAAA" w:sz="1"/>
+              <w:left w:val="single" w:color="AAAAAA" w:sz="1"/>
+              <w:bottom w:val="single" w:color="AAAAAA" w:sz="1"/>
+              <w:right w:val="single" w:color="AAAAAA" w:sz="1"/>
+            </w:tcBorders>
+            <w:tcMar>
+              <w:top w:type="dxa" w:w="60"/>
+              <w:left w:type="dxa" w:w="100"/>
+              <w:bottom w:type="dxa" w:w="60"/>
+              <w:right w:type="dxa" w:w="100"/>
+            </w:tcMar>
+          </w:tcPr>
+          <w:p>
+            <w:r>
+              <w:rPr>
+                <w:rFonts w:ascii="Arial" w:cs="Arial" w:eastAsia="Arial" w:hAnsi="Arial"/>
+                <w:b w:val="false"/>
+                <w:bCs w:val="false"/>
+                <w:i w:val="false"/>
+                <w:iCs w:val="false"/>
+                <w:sz w:val="20"/>
+                <w:szCs w:val="20"/>
+              </w:rPr>
+              <w:t xml:space="preserve">datetime</w:t>
+            </w:r>
+          </w:p>
+        </w:tc>
+        <w:tc>
+          <w:tcPr>
+            <w:tcW w:type="dxa" w:w="800"/>
+            <w:tcBorders>
+              <w:top w:val="single" w:color="AAAAAA" w:sz="1"/>
+              <w:left w:val="single" w:color="AAAAAA" w:sz="1"/>
+              <w:bottom w:val="single" w:color="AAAAAA" w:sz="1"/>
+              <w:right w:val="single" w:color="AAAAAA" w:sz="1"/>
+            </w:tcBorders>
+            <w:tcMar>
+              <w:top w:type="dxa" w:w="60"/>
+              <w:left w:type="dxa" w:w="100"/>
+              <w:bottom w:type="dxa" w:w="60"/>
+              <w:right w:type="dxa" w:w="100"/>
+            </w:tcMar>
+          </w:tcPr>
+          <w:p>
+            <w:r>
+              <w:rPr>
+                <w:rFonts w:ascii="Arial" w:cs="Arial" w:eastAsia="Arial" w:hAnsi="Arial"/>
+                <w:b w:val="false"/>
+                <w:bCs w:val="false"/>
+                <w:i w:val="false"/>
+                <w:iCs w:val="false"/>
+                <w:sz w:val="20"/>
+                <w:szCs w:val="20"/>
+              </w:rPr>
+              <w:t xml:space="preserve">No</w:t>
+            </w:r>
+          </w:p>
+        </w:tc>
+        <w:tc>
+          <w:tcPr>
+            <w:tcW w:type="dxa" w:w="2400"/>
+            <w:tcBorders>
+              <w:top w:val="single" w:color="AAAAAA" w:sz="1"/>
+              <w:left w:val="single" w:color="AAAAAA" w:sz="1"/>
+              <w:bottom w:val="single" w:color="AAAAAA" w:sz="1"/>
+              <w:right w:val="single" w:color="AAAAAA" w:sz="1"/>
+            </w:tcBorders>
+            <w:tcMar>
+              <w:top w:type="dxa" w:w="60"/>
+              <w:left w:type="dxa" w:w="100"/>
+              <w:bottom w:type="dxa" w:w="60"/>
+              <w:right w:type="dxa" w:w="100"/>
+            </w:tcMar>
+          </w:tcPr>
+          <w:p>
+            <w:r>
+              <w:rPr>
+                <w:rFonts w:ascii="Arial" w:cs="Arial" w:eastAsia="Arial" w:hAnsi="Arial"/>
+                <w:b w:val="false"/>
+                <w:bCs w:val="false"/>
+                <w:i w:val="false"/>
+                <w:iCs w:val="false"/>
+                <w:sz w:val="20"/>
+                <w:szCs w:val="20"/>
+              </w:rPr>
+              <w:t xml:space="preserve">—</w:t>
+            </w:r>
+          </w:p>
+        </w:tc>
+        <w:tc>
+          <w:tcPr>
+            <w:tcW w:type="dxa" w:w="1000"/>
+            <w:tcBorders>
+              <w:top w:val="single" w:color="AAAAAA" w:sz="1"/>
+              <w:left w:val="single" w:color="AAAAAA" w:sz="1"/>
+              <w:bottom w:val="single" w:color="AAAAAA" w:sz="1"/>
+              <w:right w:val="single" w:color="AAAAAA" w:sz="1"/>
+            </w:tcBorders>
+            <w:tcMar>
+              <w:top w:type="dxa" w:w="60"/>
+              <w:left w:type="dxa" w:w="100"/>
+              <w:bottom w:type="dxa" w:w="60"/>
+              <w:right w:type="dxa" w:w="100"/>
+            </w:tcMar>
+          </w:tcPr>
+          <w:p>
+            <w:r>
+              <w:rPr>
+                <w:rFonts w:ascii="Arial" w:cs="Arial" w:eastAsia="Arial" w:hAnsi="Arial"/>
+                <w:b w:val="false"/>
+                <w:bCs w:val="false"/>
+                <w:i w:val="false"/>
+                <w:iCs w:val="false"/>
+                <w:sz w:val="20"/>
+                <w:szCs w:val="20"/>
+              </w:rPr>
+              <w:t xml:space="preserve">—</w:t>
+            </w:r>
+          </w:p>
+        </w:tc>
+        <w:tc>
+          <w:tcPr>
+            <w:tcW w:type="dxa" w:w="1860"/>
+            <w:tcBorders>
+              <w:top w:val="single" w:color="AAAAAA" w:sz="1"/>
+              <w:left w:val="single" w:color="AAAAAA" w:sz="1"/>
+              <w:bottom w:val="single" w:color="AAAAAA" w:sz="1"/>
+              <w:right w:val="single" w:color="AAAAAA" w:sz="1"/>
+            </w:tcBorders>
+            <w:tcMar>
+              <w:top w:type="dxa" w:w="60"/>
+              <w:left w:type="dxa" w:w="100"/>
+              <w:bottom w:type="dxa" w:w="60"/>
+              <w:right w:type="dxa" w:w="100"/>
+            </w:tcMar>
+          </w:tcPr>
+          <w:p>
+            <w:r>
+              <w:rPr>
+                <w:rFonts w:ascii="Arial" w:cs="Arial" w:eastAsia="Arial" w:hAnsi="Arial"/>
+                <w:b w:val="false"/>
+                <w:bCs w:val="false"/>
+                <w:i w:val="false"/>
+                <w:iCs w:val="false"/>
+                <w:color w:val="888888"/>
+                <w:sz w:val="16"/>
+                <w:szCs w:val="16"/>
+              </w:rPr>
+              <w:t xml:space="preserve">CR-EVENTS-MANAGE-DAT-036</w:t>
+            </w:r>
+          </w:p>
+        </w:tc>
+      </w:tr>
+      <w:tr>
+        <w:tc>
+          <w:tcPr>
+            <w:tcW w:type="dxa" w:w="9360"/>
+            <w:gridSpan w:val="6"/>
+            <w:tcBorders>
+              <w:top w:val="single" w:color="AAAAAA" w:sz="1"/>
+              <w:left w:val="single" w:color="AAAAAA" w:sz="1"/>
+              <w:bottom w:val="single" w:color="AAAAAA" w:sz="1"/>
+              <w:right w:val="single" w:color="AAAAAA" w:sz="1"/>
+            </w:tcBorders>
+            <w:tcMar>
+              <w:top w:type="dxa" w:w="40"/>
+              <w:left w:type="dxa" w:w="100"/>
+              <w:bottom w:type="dxa" w:w="80"/>
+              <w:right w:type="dxa" w:w="100"/>
+            </w:tcMar>
+          </w:tcPr>
+          <w:p>
+            <w:r>
+              <w:rPr>
+                <w:rFonts w:ascii="Arial" w:cs="Arial" w:eastAsia="Arial" w:hAnsi="Arial"/>
+                <w:b w:val="false"/>
+                <w:bCs w:val="false"/>
+                <w:i w:val="false"/>
+                <w:iCs w:val="false"/>
+                <w:color w:val="888888"/>
+                <w:sz w:val="20"/>
+                <w:szCs w:val="20"/>
+              </w:rPr>
+              <w:t xml:space="preserve">Timestamp set by the Zoom integration bridge service when the post-Webinar attendance capture flow completes successfully. A non-null value indicates that EventRegistration.attendanceStatus has been written for all participants. Acts as the idempotency key — subsequent inbound triggers (Zoom webhook OR polling safety net) are no-ops once this field is set. Read-only. </w:t>
+            </w:r>
+            <w:r>
+              <w:rPr>
+                <w:rFonts w:ascii="Arial" w:cs="Arial" w:eastAsia="Arial" w:hAnsi="Arial"/>
+                <w:b/>
+                <w:bCs/>
+                <w:i w:val="false"/>
+                <w:iCs w:val="false"/>
+                <w:color w:val="888888"/>
+                <w:sz w:val="20"/>
+                <w:szCs w:val="20"/>
+              </w:rPr>
+              <w:t xml:space="preserve">Visibility: </w:t>
+            </w:r>
+            <w:r>
+              <w:rPr>
+                <w:rFonts w:ascii="Arial" w:cs="Arial" w:eastAsia="Arial" w:hAnsi="Arial"/>
+                <w:b w:val="false"/>
+                <w:bCs w:val="false"/>
+                <w:i w:val="false"/>
+                <w:iCs w:val="false"/>
+                <w:color w:val="888888"/>
+                <w:sz w:val="20"/>
+                <w:szCs w:val="20"/>
+              </w:rPr>
+              <w:t xml:space="preserve">format = Virtual or Hybrid AND status = Completed. </w:t>
+            </w:r>
+            <w:r>
+              <w:rPr>
+                <w:rFonts w:ascii="Arial" w:cs="Arial" w:eastAsia="Arial" w:hAnsi="Arial"/>
+                <w:b/>
+                <w:bCs/>
+                <w:i w:val="false"/>
+                <w:iCs w:val="false"/>
+                <w:color w:val="888888"/>
+                <w:sz w:val="20"/>
+                <w:szCs w:val="20"/>
+              </w:rPr>
+              <w:t xml:space="preserve">Domains: </w:t>
+            </w:r>
+            <w:r>
+              <w:rPr>
+                <w:rFonts w:ascii="Arial" w:cs="Arial" w:eastAsia="Arial" w:hAnsi="Arial"/>
+                <w:b w:val="false"/>
+                <w:bCs w:val="false"/>
+                <w:i w:val="false"/>
+                <w:iCs w:val="false"/>
+                <w:color w:val="888888"/>
+                <w:sz w:val="20"/>
+                <w:szCs w:val="20"/>
+              </w:rPr>
+              <w:t xml:space="preserve">CR. </w:t>
+            </w:r>
+            <w:r>
+              <w:rPr>
+                <w:rFonts w:ascii="Arial" w:cs="Arial" w:eastAsia="Arial" w:hAnsi="Arial"/>
+                <w:b/>
+                <w:bCs/>
+                <w:i w:val="false"/>
+                <w:iCs w:val="false"/>
+                <w:color w:val="888888"/>
+                <w:sz w:val="20"/>
+                <w:szCs w:val="20"/>
+              </w:rPr>
+              <w:t xml:space="preserve">Implementation: </w:t>
+            </w:r>
+            <w:r>
+              <w:rPr>
+                <w:rFonts w:ascii="Arial" w:cs="Arial" w:eastAsia="Arial" w:hAnsi="Arial"/>
+                <w:b w:val="false"/>
+                <w:bCs w:val="false"/>
+                <w:i w:val="false"/>
+                <w:iCs w:val="false"/>
+                <w:color w:val="888888"/>
+                <w:sz w:val="20"/>
+                <w:szCs w:val="20"/>
+              </w:rPr>
+              <w:t xml:space="preserve">system-populated, readOnly. See Zoom Integration Architecture v1.0 §5.7.</w:t>
+            </w:r>
+          </w:p>
+        </w:tc>
+      </w:tr>
+      <w:tr>
+        <w:tc>
+          <w:tcPr>
+            <w:tcW w:type="dxa" w:w="2200"/>
+            <w:tcBorders>
+              <w:top w:val="single" w:color="AAAAAA" w:sz="1"/>
+              <w:left w:val="single" w:color="AAAAAA" w:sz="1"/>
+              <w:bottom w:val="single" w:color="AAAAAA" w:sz="1"/>
+              <w:right w:val="single" w:color="AAAAAA" w:sz="1"/>
+            </w:tcBorders>
+            <w:shd w:fill="F2F7FB" w:val="clear"/>
+            <w:tcMar>
+              <w:top w:type="dxa" w:w="60"/>
+              <w:left w:type="dxa" w:w="100"/>
+              <w:bottom w:type="dxa" w:w="60"/>
+              <w:right w:type="dxa" w:w="100"/>
+            </w:tcMar>
+          </w:tcPr>
+          <w:p>
+            <w:r>
+              <w:rPr>
+                <w:rFonts w:ascii="Arial" w:cs="Arial" w:eastAsia="Arial" w:hAnsi="Arial"/>
+                <w:b/>
+                <w:bCs/>
+                <w:i w:val="false"/>
+                <w:iCs w:val="false"/>
+                <w:sz w:val="20"/>
+                <w:szCs w:val="20"/>
+              </w:rPr>
+              <w:t xml:space="preserve">zoomLastSyncedAt</w:t>
+            </w:r>
+          </w:p>
+        </w:tc>
+        <w:tc>
+          <w:tcPr>
+            <w:tcW w:type="dxa" w:w="1100"/>
+            <w:tcBorders>
+              <w:top w:val="single" w:color="AAAAAA" w:sz="1"/>
+              <w:left w:val="single" w:color="AAAAAA" w:sz="1"/>
+              <w:bottom w:val="single" w:color="AAAAAA" w:sz="1"/>
+              <w:right w:val="single" w:color="AAAAAA" w:sz="1"/>
+            </w:tcBorders>
+            <w:shd w:fill="F2F7FB" w:val="clear"/>
+            <w:tcMar>
+              <w:top w:type="dxa" w:w="60"/>
+              <w:left w:type="dxa" w:w="100"/>
+              <w:bottom w:type="dxa" w:w="60"/>
+              <w:right w:type="dxa" w:w="100"/>
+            </w:tcMar>
+          </w:tcPr>
+          <w:p>
+            <w:r>
+              <w:rPr>
+                <w:rFonts w:ascii="Arial" w:cs="Arial" w:eastAsia="Arial" w:hAnsi="Arial"/>
+                <w:b w:val="false"/>
+                <w:bCs w:val="false"/>
+                <w:i w:val="false"/>
+                <w:iCs w:val="false"/>
+                <w:sz w:val="20"/>
+                <w:szCs w:val="20"/>
+              </w:rPr>
+              <w:t xml:space="preserve">datetime</w:t>
+            </w:r>
+          </w:p>
+        </w:tc>
+        <w:tc>
+          <w:tcPr>
+            <w:tcW w:type="dxa" w:w="800"/>
+            <w:tcBorders>
+              <w:top w:val="single" w:color="AAAAAA" w:sz="1"/>
+              <w:left w:val="single" w:color="AAAAAA" w:sz="1"/>
+              <w:bottom w:val="single" w:color="AAAAAA" w:sz="1"/>
+              <w:right w:val="single" w:color="AAAAAA" w:sz="1"/>
+            </w:tcBorders>
+            <w:shd w:fill="F2F7FB" w:val="clear"/>
+            <w:tcMar>
+              <w:top w:type="dxa" w:w="60"/>
+              <w:left w:type="dxa" w:w="100"/>
+              <w:bottom w:type="dxa" w:w="60"/>
+              <w:right w:type="dxa" w:w="100"/>
+            </w:tcMar>
+          </w:tcPr>
+          <w:p>
+            <w:r>
+              <w:rPr>
+                <w:rFonts w:ascii="Arial" w:cs="Arial" w:eastAsia="Arial" w:hAnsi="Arial"/>
+                <w:b w:val="false"/>
+                <w:bCs w:val="false"/>
+                <w:i w:val="false"/>
+                <w:iCs w:val="false"/>
+                <w:sz w:val="20"/>
+                <w:szCs w:val="20"/>
+              </w:rPr>
+              <w:t xml:space="preserve">No</w:t>
+            </w:r>
+          </w:p>
+        </w:tc>
+        <w:tc>
+          <w:tcPr>
+            <w:tcW w:type="dxa" w:w="2400"/>
+            <w:tcBorders>
+              <w:top w:val="single" w:color="AAAAAA" w:sz="1"/>
+              <w:left w:val="single" w:color="AAAAAA" w:sz="1"/>
+              <w:bottom w:val="single" w:color="AAAAAA" w:sz="1"/>
+              <w:right w:val="single" w:color="AAAAAA" w:sz="1"/>
+            </w:tcBorders>
+            <w:shd w:fill="F2F7FB" w:val="clear"/>
+            <w:tcMar>
+              <w:top w:type="dxa" w:w="60"/>
+              <w:left w:type="dxa" w:w="100"/>
+              <w:bottom w:type="dxa" w:w="60"/>
+              <w:right w:type="dxa" w:w="100"/>
+            </w:tcMar>
+          </w:tcPr>
+          <w:p>
+            <w:r>
+              <w:rPr>
+                <w:rFonts w:ascii="Arial" w:cs="Arial" w:eastAsia="Arial" w:hAnsi="Arial"/>
+                <w:b w:val="false"/>
+                <w:bCs w:val="false"/>
+                <w:i w:val="false"/>
+                <w:iCs w:val="false"/>
+                <w:sz w:val="20"/>
+                <w:szCs w:val="20"/>
+              </w:rPr>
+              <w:t xml:space="preserve">—</w:t>
+            </w:r>
+          </w:p>
+        </w:tc>
+        <w:tc>
+          <w:tcPr>
+            <w:tcW w:type="dxa" w:w="1000"/>
+            <w:tcBorders>
+              <w:top w:val="single" w:color="AAAAAA" w:sz="1"/>
+              <w:left w:val="single" w:color="AAAAAA" w:sz="1"/>
+              <w:bottom w:val="single" w:color="AAAAAA" w:sz="1"/>
+              <w:right w:val="single" w:color="AAAAAA" w:sz="1"/>
+            </w:tcBorders>
+            <w:shd w:fill="F2F7FB" w:val="clear"/>
+            <w:tcMar>
+              <w:top w:type="dxa" w:w="60"/>
+              <w:left w:type="dxa" w:w="100"/>
+              <w:bottom w:type="dxa" w:w="60"/>
+              <w:right w:type="dxa" w:w="100"/>
+            </w:tcMar>
+          </w:tcPr>
+          <w:p>
+            <w:r>
+              <w:rPr>
+                <w:rFonts w:ascii="Arial" w:cs="Arial" w:eastAsia="Arial" w:hAnsi="Arial"/>
+                <w:b w:val="false"/>
+                <w:bCs w:val="false"/>
+                <w:i w:val="false"/>
+                <w:iCs w:val="false"/>
+                <w:sz w:val="20"/>
+                <w:szCs w:val="20"/>
+              </w:rPr>
+              <w:t xml:space="preserve">—</w:t>
+            </w:r>
+          </w:p>
+        </w:tc>
+        <w:tc>
+          <w:tcPr>
+            <w:tcW w:type="dxa" w:w="1860"/>
+            <w:tcBorders>
+              <w:top w:val="single" w:color="AAAAAA" w:sz="1"/>
+              <w:left w:val="single" w:color="AAAAAA" w:sz="1"/>
+              <w:bottom w:val="single" w:color="AAAAAA" w:sz="1"/>
+              <w:right w:val="single" w:color="AAAAAA" w:sz="1"/>
+            </w:tcBorders>
+            <w:shd w:fill="F2F7FB" w:val="clear"/>
+            <w:tcMar>
+              <w:top w:type="dxa" w:w="60"/>
+              <w:left w:type="dxa" w:w="100"/>
+              <w:bottom w:type="dxa" w:w="60"/>
+              <w:right w:type="dxa" w:w="100"/>
+            </w:tcMar>
+          </w:tcPr>
+          <w:p>
+            <w:r>
+              <w:rPr>
+                <w:rFonts w:ascii="Arial" w:cs="Arial" w:eastAsia="Arial" w:hAnsi="Arial"/>
+                <w:b w:val="false"/>
+                <w:bCs w:val="false"/>
+                <w:i w:val="false"/>
+                <w:iCs w:val="false"/>
+                <w:color w:val="888888"/>
+                <w:sz w:val="16"/>
+                <w:szCs w:val="16"/>
+              </w:rPr>
+              <w:t xml:space="preserve">CR-EVENTS-MANAGE-DAT-037</w:t>
+            </w:r>
+          </w:p>
+        </w:tc>
+      </w:tr>
+      <w:tr>
+        <w:tc>
+          <w:tcPr>
+            <w:tcW w:type="dxa" w:w="9360"/>
+            <w:gridSpan w:val="6"/>
+            <w:tcBorders>
+              <w:top w:val="single" w:color="AAAAAA" w:sz="1"/>
+              <w:left w:val="single" w:color="AAAAAA" w:sz="1"/>
+              <w:bottom w:val="single" w:color="AAAAAA" w:sz="1"/>
+              <w:right w:val="single" w:color="AAAAAA" w:sz="1"/>
+            </w:tcBorders>
+            <w:shd w:fill="F2F7FB" w:val="clear"/>
+            <w:tcMar>
+              <w:top w:type="dxa" w:w="40"/>
+              <w:left w:type="dxa" w:w="100"/>
+              <w:bottom w:type="dxa" w:w="80"/>
+              <w:right w:type="dxa" w:w="100"/>
+            </w:tcMar>
+          </w:tcPr>
+          <w:p>
+            <w:r>
+              <w:rPr>
+                <w:rFonts w:ascii="Arial" w:cs="Arial" w:eastAsia="Arial" w:hAnsi="Arial"/>
+                <w:b w:val="false"/>
+                <w:bCs w:val="false"/>
+                <w:i w:val="false"/>
+                <w:iCs w:val="false"/>
+                <w:color w:val="888888"/>
+                <w:sz w:val="20"/>
+                <w:szCs w:val="20"/>
+              </w:rPr>
+              <w:t xml:space="preserve">Timestamp updated by the Zoom integration bridge service after every successful outbound sync of Event field changes (name, dateStart, duration, description, timezone) to the Zoom Webinar. Lets operators see when the Webinar was last reconciled with the CRM record. Read-only. </w:t>
+            </w:r>
+            <w:r>
+              <w:rPr>
+                <w:rFonts w:ascii="Arial" w:cs="Arial" w:eastAsia="Arial" w:hAnsi="Arial"/>
+                <w:b/>
+                <w:bCs/>
+                <w:i w:val="false"/>
+                <w:iCs w:val="false"/>
+                <w:color w:val="888888"/>
+                <w:sz w:val="20"/>
+                <w:szCs w:val="20"/>
+              </w:rPr>
+              <w:t xml:space="preserve">Visibility: </w:t>
+            </w:r>
+            <w:r>
+              <w:rPr>
+                <w:rFonts w:ascii="Arial" w:cs="Arial" w:eastAsia="Arial" w:hAnsi="Arial"/>
+                <w:b w:val="false"/>
+                <w:bCs w:val="false"/>
+                <w:i w:val="false"/>
+                <w:iCs w:val="false"/>
+                <w:color w:val="888888"/>
+                <w:sz w:val="20"/>
+                <w:szCs w:val="20"/>
+              </w:rPr>
+              <w:t xml:space="preserve">format = Virtual or Hybrid AND status ≠ Draft. </w:t>
+            </w:r>
+            <w:r>
+              <w:rPr>
+                <w:rFonts w:ascii="Arial" w:cs="Arial" w:eastAsia="Arial" w:hAnsi="Arial"/>
+                <w:b/>
+                <w:bCs/>
+                <w:i w:val="false"/>
+                <w:iCs w:val="false"/>
+                <w:color w:val="888888"/>
+                <w:sz w:val="20"/>
+                <w:szCs w:val="20"/>
+              </w:rPr>
+              <w:t xml:space="preserve">Domains: </w:t>
+            </w:r>
+            <w:r>
+              <w:rPr>
+                <w:rFonts w:ascii="Arial" w:cs="Arial" w:eastAsia="Arial" w:hAnsi="Arial"/>
+                <w:b w:val="false"/>
+                <w:bCs w:val="false"/>
+                <w:i w:val="false"/>
+                <w:iCs w:val="false"/>
+                <w:color w:val="888888"/>
+                <w:sz w:val="20"/>
+                <w:szCs w:val="20"/>
+              </w:rPr>
+              <w:t xml:space="preserve">CR. </w:t>
+            </w:r>
+            <w:r>
+              <w:rPr>
+                <w:rFonts w:ascii="Arial" w:cs="Arial" w:eastAsia="Arial" w:hAnsi="Arial"/>
+                <w:b/>
+                <w:bCs/>
+                <w:i w:val="false"/>
+                <w:iCs w:val="false"/>
+                <w:color w:val="888888"/>
+                <w:sz w:val="20"/>
+                <w:szCs w:val="20"/>
+              </w:rPr>
+              <w:t xml:space="preserve">Implementation: </w:t>
+            </w:r>
+            <w:r>
+              <w:rPr>
+                <w:rFonts w:ascii="Arial" w:cs="Arial" w:eastAsia="Arial" w:hAnsi="Arial"/>
+                <w:b w:val="false"/>
+                <w:bCs w:val="false"/>
+                <w:i w:val="false"/>
+                <w:iCs w:val="false"/>
+                <w:color w:val="888888"/>
+                <w:sz w:val="20"/>
+                <w:szCs w:val="20"/>
+              </w:rPr>
+              <w:t xml:space="preserve">system-populated, readOnly. See Zoom Integration Architecture v1.0 §5.2.</w:t>
+            </w:r>
+          </w:p>
+        </w:tc>
+      </w:tr>
+    </w:tbl>
+    <w:p>
+      <w:pPr>
+        <w:spacing w:after="120"/>
+      </w:pPr>
+      <w:r>
+        <w:rPr>
+          <w:rFonts w:ascii="Arial" w:cs="Arial" w:eastAsia="Arial" w:hAnsi="Arial"/>
+          <w:b w:val="false"/>
+          <w:bCs w:val="false"/>
+          <w:i w:val="false"/>
+          <w:iCs w:val="false"/>
+          <w:sz w:val="22"/>
+          <w:szCs w:val="22"/>
+        </w:rPr>
+        <w:t xml:space="preserve"/>
+      </w:r>
+    </w:p>
+    <w:p>
       <w:r>
         <w:br w:type="page"/>
       </w:r>
@@ -7632,7 +9154,7 @@
           <w:sz w:val="22"/>
           <w:szCs w:val="22"/>
         </w:rPr>
-        <w:t xml:space="preserve"> Show location. Hide virtualMeetingUrl, recordingUrl.</w:t>
+        <w:t xml:space="preserve"> Show location. Hide virtualMeetingUrl, recordingUrl, zoomWebinarId, zoomHostEmail, attendanceCapturedAt, zoomLastSyncedAt.</w:t>
       </w:r>
     </w:p>
     <w:p>
@@ -7666,7 +9188,7 @@
           <w:sz w:val="22"/>
           <w:szCs w:val="22"/>
         </w:rPr>
-        <w:t xml:space="preserve"> Show virtualMeetingUrl, recordingUrl. Hide location.</w:t>
+        <w:t xml:space="preserve"> Show virtualMeetingUrl, recordingUrl, zoomWebinarId, zoomHostEmail, attendanceCapturedAt, zoomLastSyncedAt. Hide location.</w:t>
       </w:r>
     </w:p>
     <w:p>
@@ -7700,7 +9222,7 @@
           <w:sz w:val="22"/>
           <w:szCs w:val="22"/>
         </w:rPr>
-        <w:t xml:space="preserve"> Show location, virtualMeetingUrl, recordingUrl.</w:t>
+        <w:t xml:space="preserve"> Show location, virtualMeetingUrl, recordingUrl, zoomWebinarId, zoomHostEmail, attendanceCapturedAt, zoomLastSyncedAt.</w:t>
       </w:r>
     </w:p>
     <w:p>
@@ -8140,6 +9662,110 @@
       </w:r>
     </w:p>
     <w:p>
+      <w:pPr>
+        <w:pStyle w:val="Heading2"/>
+        <w:spacing w:after="120" w:before="240"/>
+      </w:pPr>
+      <w:r>
+        <w:rPr>
+          <w:rFonts w:ascii="Arial" w:cs="Arial" w:eastAsia="Arial" w:hAnsi="Arial"/>
+          <w:b/>
+          <w:bCs/>
+          <w:i w:val="false"/>
+          <w:iCs w:val="false"/>
+          <w:color w:val="1F3864"/>
+          <w:sz w:val="28"/>
+          <w:szCs w:val="28"/>
+        </w:rPr>
+        <w:t xml:space="preserve">5.4 Zoom Field Status-Driven Visibility</w:t>
+      </w:r>
+    </w:p>
+    <w:p>
+      <w:pPr>
+        <w:spacing w:after="120"/>
+      </w:pPr>
+      <w:r>
+        <w:rPr>
+          <w:rFonts w:ascii="Arial" w:cs="Arial" w:eastAsia="Arial" w:hAnsi="Arial"/>
+          <w:b w:val="false"/>
+          <w:bCs w:val="false"/>
+          <w:i w:val="false"/>
+          <w:iCs w:val="false"/>
+          <w:sz w:val="22"/>
+          <w:szCs w:val="22"/>
+        </w:rPr>
+        <w:t xml:space="preserve">In addition to the format-driven visibility in 5.1, the Zoom integration fields have status-driven visibility that layers on top:</w:t>
+      </w:r>
+    </w:p>
+    <w:p>
+      <w:pPr>
+        <w:pStyle w:val="ListParagraph"/>
+        <w:numPr>
+          <w:ilvl w:val="0"/>
+          <w:numId w:val="2"/>
+        </w:numPr>
+        <w:spacing w:after="60"/>
+      </w:pPr>
+      <w:r>
+        <w:rPr>
+          <w:rFonts w:ascii="Arial" w:cs="Arial" w:eastAsia="Arial" w:hAnsi="Arial"/>
+          <w:b/>
+          <w:bCs/>
+          <w:i w:val="false"/>
+          <w:iCs w:val="false"/>
+          <w:sz w:val="22"/>
+          <w:szCs w:val="22"/>
+        </w:rPr>
+        <w:t xml:space="preserve">zoomWebinarId, zoomHostEmail, zoomLastSyncedAt:</w:t>
+      </w:r>
+      <w:r>
+        <w:rPr>
+          <w:rFonts w:ascii="Arial" w:cs="Arial" w:eastAsia="Arial" w:hAnsi="Arial"/>
+          <w:b w:val="false"/>
+          <w:bCs w:val="false"/>
+          <w:i w:val="false"/>
+          <w:iCs w:val="false"/>
+          <w:sz w:val="22"/>
+          <w:szCs w:val="22"/>
+        </w:rPr>
+        <w:t xml:space="preserve"> visible only when status ≠ Draft (these fields are populated at the Draft → Scheduled transition).</w:t>
+      </w:r>
+    </w:p>
+    <w:p>
+      <w:pPr>
+        <w:pStyle w:val="ListParagraph"/>
+        <w:numPr>
+          <w:ilvl w:val="0"/>
+          <w:numId w:val="2"/>
+        </w:numPr>
+        <w:spacing w:after="60"/>
+      </w:pPr>
+      <w:r>
+        <w:rPr>
+          <w:rFonts w:ascii="Arial" w:cs="Arial" w:eastAsia="Arial" w:hAnsi="Arial"/>
+          <w:b/>
+          <w:bCs/>
+          <w:i w:val="false"/>
+          <w:iCs w:val="false"/>
+          <w:sz w:val="22"/>
+          <w:szCs w:val="22"/>
+        </w:rPr>
+        <w:t xml:space="preserve">attendanceCapturedAt:</w:t>
+      </w:r>
+      <w:r>
+        <w:rPr>
+          <w:rFonts w:ascii="Arial" w:cs="Arial" w:eastAsia="Arial" w:hAnsi="Arial"/>
+          <w:b w:val="false"/>
+          <w:bCs w:val="false"/>
+          <w:i w:val="false"/>
+          <w:iCs w:val="false"/>
+          <w:sz w:val="22"/>
+          <w:szCs w:val="22"/>
+        </w:rPr>
+        <w:t xml:space="preserve"> visible only when status = Completed (this field is populated only after the Webinar has ended and attendance has been captured).</w:t>
+      </w:r>
+    </w:p>
+    <w:p>
       <w:r>
         <w:br w:type="page"/>
       </w:r>
@@ -8405,6 +10031,41 @@
           <w:sz w:val="22"/>
           <w:szCs w:val="22"/>
         </w:rPr>
+        <w:t xml:space="preserve">Zoom Integration Panel</w:t>
+      </w:r>
+    </w:p>
+    <w:p>
+      <w:pPr>
+        <w:spacing w:after="120"/>
+      </w:pPr>
+      <w:r>
+        <w:rPr>
+          <w:rFonts w:ascii="Arial" w:cs="Arial" w:eastAsia="Arial" w:hAnsi="Arial"/>
+          <w:b w:val="false"/>
+          <w:bCs w:val="false"/>
+          <w:i w:val="false"/>
+          <w:iCs w:val="false"/>
+          <w:sz w:val="22"/>
+          <w:szCs w:val="22"/>
+        </w:rPr>
+        <w:t xml:space="preserve">zoomWebinarId, zoomHostEmail, zoomLastSyncedAt (visible when format = Virtual or Hybrid AND status ≠ Draft), attendanceCapturedAt (visible when format = Virtual or Hybrid AND status = Completed). All fields read-only and system-populated by the Zoom integration bridge service.</w:t>
+      </w:r>
+    </w:p>
+    <w:p>
+      <w:pPr>
+        <w:spacing w:after="120"/>
+      </w:pPr>
+      <w:r>
+        <w:rPr>
+          <w:rFonts w:ascii="Arial" w:cs="Arial" w:eastAsia="Arial" w:hAnsi="Arial"/>
+          <w:b/>
+          <w:bCs/>
+          <w:i w:val="false"/>
+          <w:iCs w:val="false"/>
+          <w:color w:val="1F3864"/>
+          <w:sz w:val="22"/>
+          <w:szCs w:val="22"/>
+        </w:rPr>
         <w:t xml:space="preserve">Registrations Panel</w:t>
       </w:r>
     </w:p>
@@ -8732,6 +10393,35 @@
           <w:szCs w:val="22"/>
         </w:rPr>
         <w:t xml:space="preserve"> This document is a Level 2 Entity PRD. No specific CRM product names appear in this document. All references to platform capabilities use generic terminology. Product-specific implementation details belong in YAML program files and implementation documentation only.</w:t>
+      </w:r>
+    </w:p>
+    <w:p>
+      <w:pPr>
+        <w:spacing w:after="120"/>
+      </w:pPr>
+      <w:r>
+        <w:rPr>
+          <w:rFonts w:ascii="Arial" w:cs="Arial" w:eastAsia="Arial" w:hAnsi="Arial"/>
+          <w:b/>
+          <w:bCs/>
+          <w:i w:val="false"/>
+          <w:iCs w:val="false"/>
+          <w:sz w:val="22"/>
+          <w:szCs w:val="22"/>
+        </w:rPr>
+        <w:t xml:space="preserve">11. Zoom integration field provisioning:</w:t>
+      </w:r>
+      <w:r>
+        <w:rPr>
+          <w:rFonts w:ascii="Arial" w:cs="Arial" w:eastAsia="Arial" w:hAnsi="Arial"/>
+          <w:b w:val="false"/>
+          <w:bCs w:val="false"/>
+          <w:i w:val="false"/>
+          <w:iCs w:val="false"/>
+          <w:sz w:val="22"/>
+          <w:szCs w:val="22"/>
+        </w:rPr>
+        <w:t xml:space="preserve"> The four Zoom integration fields (zoomWebinarId, zoomHostEmail, attendanceCapturedAt, zoomLastSyncedAt) are provisioned by CRM Builder when the deployment YAML includes a zoomConfig block. For deployments without Zoom integration, these fields are not provisioned. The integration logic is documented in PRDs/product/zoom-integration-architecture.md v1.0 in the crmbuilder repo. Dependencies between these fields and the existing virtualMeetingUrl and registrationUrl fields are documented in §5.1 and §5.7 of that architecture.</w:t>
       </w:r>
     </w:p>
     <w:p>
@@ -9722,6 +11412,136 @@
                 <w:szCs w:val="20"/>
               </w:rPr>
               <w:t xml:space="preserve">Self-cancellation removed entirely. All registration cancellations are staff-initiated through the Content and Event Administrator. Confirmation email directs recipients to contact a dedicated events address to cancel. Likelihood that the target CRM can support self-cancellation without significant customization is low, and the effort is not justified by the value.</w:t>
+            </w:r>
+          </w:p>
+        </w:tc>
+      </w:tr>
+      <w:tr>
+        <w:tc>
+          <w:tcPr>
+            <w:tcW w:type="dxa" w:w="1500"/>
+            <w:tcBorders>
+              <w:top w:val="single" w:color="AAAAAA" w:sz="1"/>
+              <w:left w:val="single" w:color="AAAAAA" w:sz="1"/>
+              <w:bottom w:val="single" w:color="AAAAAA" w:sz="1"/>
+              <w:right w:val="single" w:color="AAAAAA" w:sz="1"/>
+            </w:tcBorders>
+            <w:tcMar>
+              <w:top w:type="dxa" w:w="60"/>
+              <w:left w:type="dxa" w:w="100"/>
+              <w:bottom w:type="dxa" w:w="60"/>
+              <w:right w:type="dxa" w:w="100"/>
+            </w:tcMar>
+          </w:tcPr>
+          <w:p>
+            <w:r>
+              <w:rPr>
+                <w:rFonts w:ascii="Arial" w:cs="Arial" w:eastAsia="Arial" w:hAnsi="Arial"/>
+                <w:b/>
+                <w:bCs/>
+                <w:i w:val="false"/>
+                <w:iCs w:val="false"/>
+                <w:sz w:val="20"/>
+                <w:szCs w:val="20"/>
+              </w:rPr>
+              <w:t xml:space="preserve">EVT-DEC-011</w:t>
+            </w:r>
+          </w:p>
+        </w:tc>
+        <w:tc>
+          <w:tcPr>
+            <w:tcW w:type="dxa" w:w="7860"/>
+            <w:tcBorders>
+              <w:top w:val="single" w:color="AAAAAA" w:sz="1"/>
+              <w:left w:val="single" w:color="AAAAAA" w:sz="1"/>
+              <w:bottom w:val="single" w:color="AAAAAA" w:sz="1"/>
+              <w:right w:val="single" w:color="AAAAAA" w:sz="1"/>
+            </w:tcBorders>
+            <w:tcMar>
+              <w:top w:type="dxa" w:w="60"/>
+              <w:left w:type="dxa" w:w="100"/>
+              <w:bottom w:type="dxa" w:w="60"/>
+              <w:right w:type="dxa" w:w="100"/>
+            </w:tcMar>
+          </w:tcPr>
+          <w:p>
+            <w:r>
+              <w:rPr>
+                <w:rFonts w:ascii="Arial" w:cs="Arial" w:eastAsia="Arial" w:hAnsi="Arial"/>
+                <w:b w:val="false"/>
+                <w:bCs w:val="false"/>
+                <w:i w:val="false"/>
+                <w:iCs w:val="false"/>
+                <w:sz w:val="20"/>
+                <w:szCs w:val="20"/>
+              </w:rPr>
+              <w:t xml:space="preserve">Zoom integration fields are provisioned only for deployments with Zoom integration enabled. The four fields (zoomWebinarId, zoomHostEmail, attendanceCapturedAt, zoomLastSyncedAt) and the system-populated semantics on virtualMeetingUrl and registrationUrl are conditional on the deployment YAML including zoomConfig. For non-Zoom deployments, virtualMeetingUrl and registrationUrl remain manually populated as documented in v1.0 of this PRD.</w:t>
+            </w:r>
+          </w:p>
+        </w:tc>
+      </w:tr>
+      <w:tr>
+        <w:tc>
+          <w:tcPr>
+            <w:tcW w:type="dxa" w:w="1500"/>
+            <w:tcBorders>
+              <w:top w:val="single" w:color="AAAAAA" w:sz="1"/>
+              <w:left w:val="single" w:color="AAAAAA" w:sz="1"/>
+              <w:bottom w:val="single" w:color="AAAAAA" w:sz="1"/>
+              <w:right w:val="single" w:color="AAAAAA" w:sz="1"/>
+            </w:tcBorders>
+            <w:shd w:fill="F2F7FB" w:val="clear"/>
+            <w:tcMar>
+              <w:top w:type="dxa" w:w="60"/>
+              <w:left w:type="dxa" w:w="100"/>
+              <w:bottom w:type="dxa" w:w="60"/>
+              <w:right w:type="dxa" w:w="100"/>
+            </w:tcMar>
+          </w:tcPr>
+          <w:p>
+            <w:r>
+              <w:rPr>
+                <w:rFonts w:ascii="Arial" w:cs="Arial" w:eastAsia="Arial" w:hAnsi="Arial"/>
+                <w:b/>
+                <w:bCs/>
+                <w:i w:val="false"/>
+                <w:iCs w:val="false"/>
+                <w:sz w:val="20"/>
+                <w:szCs w:val="20"/>
+              </w:rPr>
+              <w:t xml:space="preserve">EVT-DEC-012</w:t>
+            </w:r>
+          </w:p>
+        </w:tc>
+        <w:tc>
+          <w:tcPr>
+            <w:tcW w:type="dxa" w:w="7860"/>
+            <w:tcBorders>
+              <w:top w:val="single" w:color="AAAAAA" w:sz="1"/>
+              <w:left w:val="single" w:color="AAAAAA" w:sz="1"/>
+              <w:bottom w:val="single" w:color="AAAAAA" w:sz="1"/>
+              <w:right w:val="single" w:color="AAAAAA" w:sz="1"/>
+            </w:tcBorders>
+            <w:shd w:fill="F2F7FB" w:val="clear"/>
+            <w:tcMar>
+              <w:top w:type="dxa" w:w="60"/>
+              <w:left w:type="dxa" w:w="100"/>
+              <w:bottom w:type="dxa" w:w="60"/>
+              <w:right w:type="dxa" w:w="100"/>
+            </w:tcMar>
+          </w:tcPr>
+          <w:p>
+            <w:r>
+              <w:rPr>
+                <w:rFonts w:ascii="Arial" w:cs="Arial" w:eastAsia="Arial" w:hAnsi="Arial"/>
+                <w:b w:val="false"/>
+                <w:bCs w:val="false"/>
+                <w:i w:val="false"/>
+                <w:iCs w:val="false"/>
+                <w:sz w:val="20"/>
+                <w:szCs w:val="20"/>
+              </w:rPr>
+              <w:t xml:space="preserve">registrationUrl population source depends on format. For Virtual/Hybrid Events with Zoom integration enabled, the Zoom Webinar’s registration URL is the value. For In-Person Events (or Virtual/Hybrid without Zoom integration), the value is generated by the CRM-native registration mechanism. The field’s read-only behavior and dynamic-logic visibility (status ≠ Draft) are unchanged from v1.0.</w:t>
             </w:r>
           </w:p>
         </w:tc>

</xml_diff>

<commit_message>
Event Entity PRD v1.2 -> v1.3: publishing fields + recordingUrl re-definition
Part of the batched CR-EVENTS publishing / CR-RESOURCES carry-forward.
- New Section 3.6 Publishing Fields: listedPublicly (DAT-054, boolean, reversible,
  editable only while Scheduled, auto-cleared on Cancel/Postpone) and publishedAt
  (DAT-055, datetime, system-set on first listing, read-only).
- recordingUrl (DAT-030) re-defined as the raw-source reference to the unedited
  recording: auto-populated by the virtual meeting platform integration when
  available, manual entry fallback, editable, visible for all formats; edited
  published copy lives on a separate Resource record.
- Removed recordingUrl from the format field driven-visibility list.
- EVT-DEC-013 (publish flag distinct/reversible from Scheduled) and EVT-DEC-014
  (list membership rule, drop-off at start, auto-unlist) added; v1.3 change-log row.
</commit_message>
<xml_diff>
--- a/PRDs/entities/Event-Entity-PRD.docx
+++ b/PRDs/entities/Event-Entity-PRD.docx
@@ -309,7 +309,7 @@
                 <w:sz w:val="20"/>
                 <w:szCs w:val="20"/>
               </w:rPr>
-              <w:t xml:space="preserve">1.2</w:t>
+              <w:t xml:space="preserve">1.3</w:t>
             </w:r>
           </w:p>
         </w:tc>
@@ -439,7 +439,7 @@
                 <w:sz w:val="20"/>
                 <w:szCs w:val="20"/>
               </w:rPr>
-              <w:t xml:space="preserve">05-29-26 14:00</w:t>
+              <w:t xml:space="preserve">05-29-26 16:30</w:t>
             </w:r>
           </w:p>
         </w:tc>
@@ -3307,7 +3307,7 @@
                 <w:sz w:val="20"/>
                 <w:szCs w:val="20"/>
               </w:rPr>
-              <w:t xml:space="preserve">The event delivery format. Required at Draft creation. Drives dynamic logic visibility on location, virtualMeetingUrl, and recordingUrl. Hybrid is a permitted value but aspirational in v1.0. </w:t>
+              <w:t xml:space="preserve">The event delivery format. Required at Draft creation. Drives dynamic logic visibility on location and virtualMeetingUrl. Hybrid is a permitted value but aspirational in v1.0. </w:t>
             </w:r>
             <w:r>
               <w:rPr>
@@ -5284,7 +5284,7 @@
                 <w:sz w:val="20"/>
                 <w:szCs w:val="20"/>
               </w:rPr>
-              <w:t xml:space="preserve">Optional link to an externally hosted event recording. Visible via dynamic logic when format is Virtual or Hybrid. Recording and publishing are out of scope; the field is a reference only. </w:t>
+              <w:t xml:space="preserve">Raw-source reference to the unedited recording of the event in the system that captured it. When the virtual meeting platform integration is enabled and a recording becomes available after the event, the integration populates this field automatically. When there is no automated connection to a recording system — for example, an in-person event recorded on separate equipment, or a virtual event on a platform without integration — the administrator enters the link manually. The field is editable in all cases: automatic population fills it when a recording is detected and the field is empty, and a value the administrator has entered or edited is preserved rather than overwritten. Its purpose is to be the administrator’s entry point for turning a recording into a published resource: the administrator follows this link to reach the raw recording, then downloads, edits, and re-hosts the finished version in a reliable location. This field is a back-office reference only. It is not the public, published recording link and never appears on the public Resources page; the edited, publicly accessible copy lives on a separate Resource record that links back to this Event (see the Resource entity). Visible for all event formats, since a recording may exist for any event. </w:t>
             </w:r>
             <w:r>
               <w:rPr>
@@ -8245,6 +8245,637 @@
     </w:p>
     <w:p>
       <w:pPr>
+        <w:pStyle w:val="Heading2"/>
+      </w:pPr>
+      <w:r>
+        <w:rPr>
+          <w:rFonts w:ascii="Arial" w:cs="Arial" w:eastAsia="Arial" w:hAnsi="Arial"/>
+        </w:rPr>
+        <w:t xml:space="preserve">3.6 Publishing Fields</w:t>
+      </w:r>
+    </w:p>
+    <w:p>
+      <w:r>
+        <w:rPr>
+          <w:rFonts w:ascii="Arial" w:cs="Arial" w:eastAsia="Arial" w:hAnsi="Arial"/>
+          <w:sz w:val="20"/>
+          <w:szCs w:val="20"/>
+        </w:rPr>
+        <w:t xml:space="preserve">The following fields control whether the event appears on the public list of available events. Publishing to the list is a deliberate, reversible administrator action that is independent of the event’s status and of whether registration is open. The publishing workflow is defined in CR-EVENTS-MANAGE.</w:t>
+      </w:r>
+    </w:p>
+    <w:tbl>
+      <w:tblPr>
+        <w:tblW w:type="dxa" w:w="9360"/>
+        <w:tblBorders>
+          <w:top w:val="single" w:color="AAAAAA" w:sz="1"/>
+          <w:left w:val="single" w:color="AAAAAA" w:sz="1"/>
+          <w:bottom w:val="single" w:color="AAAAAA" w:sz="1"/>
+          <w:right w:val="single" w:color="AAAAAA" w:sz="1"/>
+          <w:insideH w:val="single" w:color="AAAAAA" w:sz="1"/>
+          <w:insideV w:val="single" w:color="AAAAAA" w:sz="1"/>
+        </w:tblBorders>
+      </w:tblPr>
+      <w:tblGrid>
+        <w:gridCol w:w="1500"/>
+        <w:gridCol w:w="900"/>
+        <w:gridCol w:w="650"/>
+        <w:gridCol w:w="900"/>
+        <w:gridCol w:w="2550"/>
+        <w:gridCol w:w="2860"/>
+      </w:tblGrid>
+      <w:tr>
+        <w:tc>
+          <w:tcPr>
+            <w:tcW w:type="dxa" w:w="1500"/>
+            <w:tcBorders>
+              <w:top w:val="single" w:color="AAAAAA" w:sz="1"/>
+              <w:left w:val="single" w:color="AAAAAA" w:sz="1"/>
+              <w:bottom w:val="single" w:color="AAAAAA" w:sz="1"/>
+              <w:right w:val="single" w:color="AAAAAA" w:sz="1"/>
+            </w:tcBorders>
+            <w:shd w:fill="1F3864" w:val="clear"/>
+            <w:tcMar>
+              <w:top w:type="dxa" w:w="60"/>
+              <w:left w:type="dxa" w:w="100"/>
+              <w:bottom w:type="dxa" w:w="60"/>
+              <w:right w:type="dxa" w:w="100"/>
+            </w:tcMar>
+          </w:tcPr>
+          <w:p>
+            <w:r>
+              <w:rPr>
+                <w:rFonts w:ascii="Arial" w:cs="Arial" w:eastAsia="Arial" w:hAnsi="Arial"/>
+                <w:b/>
+                <w:bCs/>
+                <w:i w:val="false"/>
+                <w:iCs w:val="false"/>
+                <w:color w:val="FFFFFF"/>
+                <w:sz w:val="20"/>
+                <w:szCs w:val="20"/>
+              </w:rPr>
+              <w:t xml:space="preserve">Field Name</w:t>
+            </w:r>
+          </w:p>
+        </w:tc>
+        <w:tc>
+          <w:tcPr>
+            <w:tcW w:type="dxa" w:w="900"/>
+            <w:tcBorders>
+              <w:top w:val="single" w:color="AAAAAA" w:sz="1"/>
+              <w:left w:val="single" w:color="AAAAAA" w:sz="1"/>
+              <w:bottom w:val="single" w:color="AAAAAA" w:sz="1"/>
+              <w:right w:val="single" w:color="AAAAAA" w:sz="1"/>
+            </w:tcBorders>
+            <w:shd w:fill="1F3864" w:val="clear"/>
+            <w:tcMar>
+              <w:top w:type="dxa" w:w="60"/>
+              <w:left w:type="dxa" w:w="100"/>
+              <w:bottom w:type="dxa" w:w="60"/>
+              <w:right w:type="dxa" w:w="100"/>
+            </w:tcMar>
+          </w:tcPr>
+          <w:p>
+            <w:r>
+              <w:rPr>
+                <w:rFonts w:ascii="Arial" w:cs="Arial" w:eastAsia="Arial" w:hAnsi="Arial"/>
+                <w:b/>
+                <w:bCs/>
+                <w:i w:val="false"/>
+                <w:iCs w:val="false"/>
+                <w:color w:val="FFFFFF"/>
+                <w:sz w:val="20"/>
+                <w:szCs w:val="20"/>
+              </w:rPr>
+              <w:t xml:space="preserve">Type</w:t>
+            </w:r>
+          </w:p>
+        </w:tc>
+        <w:tc>
+          <w:tcPr>
+            <w:tcW w:type="dxa" w:w="650"/>
+            <w:tcBorders>
+              <w:top w:val="single" w:color="AAAAAA" w:sz="1"/>
+              <w:left w:val="single" w:color="AAAAAA" w:sz="1"/>
+              <w:bottom w:val="single" w:color="AAAAAA" w:sz="1"/>
+              <w:right w:val="single" w:color="AAAAAA" w:sz="1"/>
+            </w:tcBorders>
+            <w:shd w:fill="1F3864" w:val="clear"/>
+            <w:tcMar>
+              <w:top w:type="dxa" w:w="60"/>
+              <w:left w:type="dxa" w:w="100"/>
+              <w:bottom w:type="dxa" w:w="60"/>
+              <w:right w:type="dxa" w:w="100"/>
+            </w:tcMar>
+          </w:tcPr>
+          <w:p>
+            <w:r>
+              <w:rPr>
+                <w:rFonts w:ascii="Arial" w:cs="Arial" w:eastAsia="Arial" w:hAnsi="Arial"/>
+                <w:b/>
+                <w:bCs/>
+                <w:i w:val="false"/>
+                <w:iCs w:val="false"/>
+                <w:color w:val="FFFFFF"/>
+                <w:sz w:val="20"/>
+                <w:szCs w:val="20"/>
+              </w:rPr>
+              <w:t xml:space="preserve">Req</w:t>
+            </w:r>
+          </w:p>
+        </w:tc>
+        <w:tc>
+          <w:tcPr>
+            <w:tcW w:type="dxa" w:w="900"/>
+            <w:tcBorders>
+              <w:top w:val="single" w:color="AAAAAA" w:sz="1"/>
+              <w:left w:val="single" w:color="AAAAAA" w:sz="1"/>
+              <w:bottom w:val="single" w:color="AAAAAA" w:sz="1"/>
+              <w:right w:val="single" w:color="AAAAAA" w:sz="1"/>
+            </w:tcBorders>
+            <w:shd w:fill="1F3864" w:val="clear"/>
+            <w:tcMar>
+              <w:top w:type="dxa" w:w="60"/>
+              <w:left w:type="dxa" w:w="100"/>
+              <w:bottom w:type="dxa" w:w="60"/>
+              <w:right w:type="dxa" w:w="100"/>
+            </w:tcMar>
+          </w:tcPr>
+          <w:p>
+            <w:r>
+              <w:rPr>
+                <w:rFonts w:ascii="Arial" w:cs="Arial" w:eastAsia="Arial" w:hAnsi="Arial"/>
+                <w:b/>
+                <w:bCs/>
+                <w:i w:val="false"/>
+                <w:iCs w:val="false"/>
+                <w:color w:val="FFFFFF"/>
+                <w:sz w:val="20"/>
+                <w:szCs w:val="20"/>
+              </w:rPr>
+              <w:t xml:space="preserve">Default</w:t>
+            </w:r>
+          </w:p>
+        </w:tc>
+        <w:tc>
+          <w:tcPr>
+            <w:tcW w:type="dxa" w:w="2550"/>
+            <w:tcBorders>
+              <w:top w:val="single" w:color="AAAAAA" w:sz="1"/>
+              <w:left w:val="single" w:color="AAAAAA" w:sz="1"/>
+              <w:bottom w:val="single" w:color="AAAAAA" w:sz="1"/>
+              <w:right w:val="single" w:color="AAAAAA" w:sz="1"/>
+            </w:tcBorders>
+            <w:shd w:fill="1F3864" w:val="clear"/>
+            <w:tcMar>
+              <w:top w:type="dxa" w:w="60"/>
+              <w:left w:type="dxa" w:w="100"/>
+              <w:bottom w:type="dxa" w:w="60"/>
+              <w:right w:type="dxa" w:w="100"/>
+            </w:tcMar>
+          </w:tcPr>
+          <w:p>
+            <w:r>
+              <w:rPr>
+                <w:rFonts w:ascii="Arial" w:cs="Arial" w:eastAsia="Arial" w:hAnsi="Arial"/>
+                <w:b/>
+                <w:bCs/>
+                <w:i w:val="false"/>
+                <w:iCs w:val="false"/>
+                <w:color w:val="FFFFFF"/>
+                <w:sz w:val="20"/>
+                <w:szCs w:val="20"/>
+              </w:rPr>
+              <w:t xml:space="preserve">Identifier</w:t>
+            </w:r>
+          </w:p>
+        </w:tc>
+        <w:tc>
+          <w:tcPr>
+            <w:tcW w:type="dxa" w:w="2860"/>
+            <w:tcBorders>
+              <w:top w:val="single" w:color="AAAAAA" w:sz="1"/>
+              <w:left w:val="single" w:color="AAAAAA" w:sz="1"/>
+              <w:bottom w:val="single" w:color="AAAAAA" w:sz="1"/>
+              <w:right w:val="single" w:color="AAAAAA" w:sz="1"/>
+            </w:tcBorders>
+            <w:shd w:fill="1F3864" w:val="clear"/>
+            <w:tcMar>
+              <w:top w:type="dxa" w:w="60"/>
+              <w:left w:type="dxa" w:w="100"/>
+              <w:bottom w:type="dxa" w:w="60"/>
+              <w:right w:type="dxa" w:w="100"/>
+            </w:tcMar>
+          </w:tcPr>
+          <w:p>
+            <w:r>
+              <w:rPr>
+                <w:rFonts w:ascii="Arial" w:cs="Arial" w:eastAsia="Arial" w:hAnsi="Arial"/>
+                <w:b/>
+                <w:bCs/>
+                <w:i w:val="false"/>
+                <w:iCs w:val="false"/>
+                <w:color w:val="FFFFFF"/>
+                <w:sz w:val="20"/>
+                <w:szCs w:val="20"/>
+              </w:rPr>
+              <w:t xml:space="preserve">Description</w:t>
+            </w:r>
+          </w:p>
+        </w:tc>
+      </w:tr>
+      <w:tr>
+        <w:tc>
+          <w:tcPr>
+            <w:tcW w:type="dxa" w:w="1500"/>
+            <w:tcBorders>
+              <w:top w:val="single" w:color="AAAAAA" w:sz="1"/>
+              <w:left w:val="single" w:color="AAAAAA" w:sz="1"/>
+              <w:bottom w:val="single" w:color="AAAAAA" w:sz="1"/>
+              <w:right w:val="single" w:color="AAAAAA" w:sz="1"/>
+            </w:tcBorders>
+            <w:shd w:fill="F2F7FB" w:val="clear"/>
+            <w:tcMar>
+              <w:top w:type="dxa" w:w="60"/>
+              <w:left w:type="dxa" w:w="100"/>
+              <w:bottom w:type="dxa" w:w="60"/>
+              <w:right w:type="dxa" w:w="100"/>
+            </w:tcMar>
+          </w:tcPr>
+          <w:p>
+            <w:r>
+              <w:rPr>
+                <w:rFonts w:ascii="Arial" w:cs="Arial" w:eastAsia="Arial" w:hAnsi="Arial"/>
+                <w:b/>
+                <w:bCs/>
+                <w:i w:val="false"/>
+                <w:iCs w:val="false"/>
+                <w:sz w:val="20"/>
+                <w:szCs w:val="20"/>
+              </w:rPr>
+              <w:t xml:space="preserve">listedPublicly</w:t>
+            </w:r>
+          </w:p>
+        </w:tc>
+        <w:tc>
+          <w:tcPr>
+            <w:tcW w:type="dxa" w:w="900"/>
+            <w:tcBorders>
+              <w:top w:val="single" w:color="AAAAAA" w:sz="1"/>
+              <w:left w:val="single" w:color="AAAAAA" w:sz="1"/>
+              <w:bottom w:val="single" w:color="AAAAAA" w:sz="1"/>
+              <w:right w:val="single" w:color="AAAAAA" w:sz="1"/>
+            </w:tcBorders>
+            <w:shd w:fill="F2F7FB" w:val="clear"/>
+            <w:tcMar>
+              <w:top w:type="dxa" w:w="60"/>
+              <w:left w:type="dxa" w:w="100"/>
+              <w:bottom w:type="dxa" w:w="60"/>
+              <w:right w:type="dxa" w:w="100"/>
+            </w:tcMar>
+          </w:tcPr>
+          <w:p>
+            <w:r>
+              <w:rPr>
+                <w:rFonts w:ascii="Arial" w:cs="Arial" w:eastAsia="Arial" w:hAnsi="Arial"/>
+                <w:b w:val="false"/>
+                <w:bCs w:val="false"/>
+                <w:i w:val="false"/>
+                <w:iCs w:val="false"/>
+                <w:sz w:val="20"/>
+                <w:szCs w:val="20"/>
+              </w:rPr>
+              <w:t xml:space="preserve">boolean</w:t>
+            </w:r>
+          </w:p>
+        </w:tc>
+        <w:tc>
+          <w:tcPr>
+            <w:tcW w:type="dxa" w:w="650"/>
+            <w:tcBorders>
+              <w:top w:val="single" w:color="AAAAAA" w:sz="1"/>
+              <w:left w:val="single" w:color="AAAAAA" w:sz="1"/>
+              <w:bottom w:val="single" w:color="AAAAAA" w:sz="1"/>
+              <w:right w:val="single" w:color="AAAAAA" w:sz="1"/>
+            </w:tcBorders>
+            <w:shd w:fill="F2F7FB" w:val="clear"/>
+            <w:tcMar>
+              <w:top w:type="dxa" w:w="60"/>
+              <w:left w:type="dxa" w:w="100"/>
+              <w:bottom w:type="dxa" w:w="60"/>
+              <w:right w:type="dxa" w:w="100"/>
+            </w:tcMar>
+          </w:tcPr>
+          <w:p>
+            <w:r>
+              <w:rPr>
+                <w:rFonts w:ascii="Arial" w:cs="Arial" w:eastAsia="Arial" w:hAnsi="Arial"/>
+                <w:b w:val="false"/>
+                <w:bCs w:val="false"/>
+                <w:i w:val="false"/>
+                <w:iCs w:val="false"/>
+                <w:sz w:val="20"/>
+                <w:szCs w:val="20"/>
+              </w:rPr>
+              <w:t xml:space="preserve">No</w:t>
+            </w:r>
+          </w:p>
+        </w:tc>
+        <w:tc>
+          <w:tcPr>
+            <w:tcW w:type="dxa" w:w="900"/>
+            <w:tcBorders>
+              <w:top w:val="single" w:color="AAAAAA" w:sz="1"/>
+              <w:left w:val="single" w:color="AAAAAA" w:sz="1"/>
+              <w:bottom w:val="single" w:color="AAAAAA" w:sz="1"/>
+              <w:right w:val="single" w:color="AAAAAA" w:sz="1"/>
+            </w:tcBorders>
+            <w:shd w:fill="F2F7FB" w:val="clear"/>
+            <w:tcMar>
+              <w:top w:type="dxa" w:w="60"/>
+              <w:left w:type="dxa" w:w="100"/>
+              <w:bottom w:type="dxa" w:w="60"/>
+              <w:right w:type="dxa" w:w="100"/>
+            </w:tcMar>
+          </w:tcPr>
+          <w:p>
+            <w:r>
+              <w:rPr>
+                <w:rFonts w:ascii="Arial" w:cs="Arial" w:eastAsia="Arial" w:hAnsi="Arial"/>
+                <w:b w:val="false"/>
+                <w:bCs w:val="false"/>
+                <w:i w:val="false"/>
+                <w:iCs w:val="false"/>
+                <w:sz w:val="20"/>
+                <w:szCs w:val="20"/>
+              </w:rPr>
+              <w:t xml:space="preserve">false</w:t>
+            </w:r>
+          </w:p>
+        </w:tc>
+        <w:tc>
+          <w:tcPr>
+            <w:tcW w:type="dxa" w:w="2550"/>
+            <w:tcBorders>
+              <w:top w:val="single" w:color="AAAAAA" w:sz="1"/>
+              <w:left w:val="single" w:color="AAAAAA" w:sz="1"/>
+              <w:bottom w:val="single" w:color="AAAAAA" w:sz="1"/>
+              <w:right w:val="single" w:color="AAAAAA" w:sz="1"/>
+            </w:tcBorders>
+            <w:shd w:fill="F2F7FB" w:val="clear"/>
+            <w:tcMar>
+              <w:top w:type="dxa" w:w="60"/>
+              <w:left w:type="dxa" w:w="100"/>
+              <w:bottom w:type="dxa" w:w="60"/>
+              <w:right w:type="dxa" w:w="100"/>
+            </w:tcMar>
+          </w:tcPr>
+          <w:p>
+            <w:r>
+              <w:rPr>
+                <w:rFonts w:ascii="Arial" w:cs="Arial" w:eastAsia="Arial" w:hAnsi="Arial"/>
+                <w:b w:val="false"/>
+                <w:bCs w:val="false"/>
+                <w:i w:val="false"/>
+                <w:iCs w:val="false"/>
+                <w:sz w:val="20"/>
+                <w:szCs w:val="20"/>
+              </w:rPr>
+              <w:t xml:space="preserve">CR-EVENTS-MANAGE-DAT-054</w:t>
+            </w:r>
+          </w:p>
+        </w:tc>
+        <w:tc>
+          <w:tcPr>
+            <w:tcW w:type="dxa" w:w="2860"/>
+            <w:tcBorders>
+              <w:top w:val="single" w:color="AAAAAA" w:sz="1"/>
+              <w:left w:val="single" w:color="AAAAAA" w:sz="1"/>
+              <w:bottom w:val="single" w:color="AAAAAA" w:sz="1"/>
+              <w:right w:val="single" w:color="AAAAAA" w:sz="1"/>
+            </w:tcBorders>
+            <w:shd w:fill="F2F7FB" w:val="clear"/>
+            <w:tcMar>
+              <w:top w:type="dxa" w:w="60"/>
+              <w:left w:type="dxa" w:w="100"/>
+              <w:bottom w:type="dxa" w:w="60"/>
+              <w:right w:type="dxa" w:w="100"/>
+            </w:tcMar>
+          </w:tcPr>
+          <w:p>
+            <w:r>
+              <w:rPr>
+                <w:rFonts w:ascii="Arial" w:cs="Arial" w:eastAsia="Arial" w:hAnsi="Arial"/>
+                <w:b w:val="false"/>
+                <w:bCs w:val="false"/>
+                <w:i w:val="false"/>
+                <w:iCs w:val="false"/>
+                <w:sz w:val="20"/>
+                <w:szCs w:val="20"/>
+              </w:rPr>
+              <w:t xml:space="preserve">Whether the event is currently shown on the public list of available events. Set true by the explicit publish-to-the-list action and false by unlisting; both directions are reversible. Editable only while the event is Scheduled. The system clears it automatically when the event moves to Cancelled or Postponed. Independent of whether registration is open.</w:t>
+            </w:r>
+          </w:p>
+        </w:tc>
+      </w:tr>
+      <w:tr>
+        <w:tc>
+          <w:tcPr>
+            <w:tcW w:type="dxa" w:w="1500"/>
+            <w:tcBorders>
+              <w:top w:val="single" w:color="AAAAAA" w:sz="1"/>
+              <w:left w:val="single" w:color="AAAAAA" w:sz="1"/>
+              <w:bottom w:val="single" w:color="AAAAAA" w:sz="1"/>
+              <w:right w:val="single" w:color="AAAAAA" w:sz="1"/>
+            </w:tcBorders>
+            <w:shd w:fill="F2F7FB" w:val="clear"/>
+            <w:tcMar>
+              <w:top w:type="dxa" w:w="60"/>
+              <w:left w:type="dxa" w:w="100"/>
+              <w:bottom w:type="dxa" w:w="60"/>
+              <w:right w:type="dxa" w:w="100"/>
+            </w:tcMar>
+          </w:tcPr>
+          <w:p>
+            <w:r>
+              <w:rPr>
+                <w:rFonts w:ascii="Arial" w:cs="Arial" w:eastAsia="Arial" w:hAnsi="Arial"/>
+                <w:b/>
+                <w:bCs/>
+                <w:i w:val="false"/>
+                <w:iCs w:val="false"/>
+                <w:sz w:val="20"/>
+                <w:szCs w:val="20"/>
+              </w:rPr>
+              <w:t xml:space="preserve">publishedAt</w:t>
+            </w:r>
+          </w:p>
+        </w:tc>
+        <w:tc>
+          <w:tcPr>
+            <w:tcW w:type="dxa" w:w="900"/>
+            <w:tcBorders>
+              <w:top w:val="single" w:color="AAAAAA" w:sz="1"/>
+              <w:left w:val="single" w:color="AAAAAA" w:sz="1"/>
+              <w:bottom w:val="single" w:color="AAAAAA" w:sz="1"/>
+              <w:right w:val="single" w:color="AAAAAA" w:sz="1"/>
+            </w:tcBorders>
+            <w:shd w:fill="F2F7FB" w:val="clear"/>
+            <w:tcMar>
+              <w:top w:type="dxa" w:w="60"/>
+              <w:left w:type="dxa" w:w="100"/>
+              <w:bottom w:type="dxa" w:w="60"/>
+              <w:right w:type="dxa" w:w="100"/>
+            </w:tcMar>
+          </w:tcPr>
+          <w:p>
+            <w:r>
+              <w:rPr>
+                <w:rFonts w:ascii="Arial" w:cs="Arial" w:eastAsia="Arial" w:hAnsi="Arial"/>
+                <w:b w:val="false"/>
+                <w:bCs w:val="false"/>
+                <w:i w:val="false"/>
+                <w:iCs w:val="false"/>
+                <w:sz w:val="20"/>
+                <w:szCs w:val="20"/>
+              </w:rPr>
+              <w:t xml:space="preserve">datetime</w:t>
+            </w:r>
+          </w:p>
+        </w:tc>
+        <w:tc>
+          <w:tcPr>
+            <w:tcW w:type="dxa" w:w="650"/>
+            <w:tcBorders>
+              <w:top w:val="single" w:color="AAAAAA" w:sz="1"/>
+              <w:left w:val="single" w:color="AAAAAA" w:sz="1"/>
+              <w:bottom w:val="single" w:color="AAAAAA" w:sz="1"/>
+              <w:right w:val="single" w:color="AAAAAA" w:sz="1"/>
+            </w:tcBorders>
+            <w:shd w:fill="F2F7FB" w:val="clear"/>
+            <w:tcMar>
+              <w:top w:type="dxa" w:w="60"/>
+              <w:left w:type="dxa" w:w="100"/>
+              <w:bottom w:type="dxa" w:w="60"/>
+              <w:right w:type="dxa" w:w="100"/>
+            </w:tcMar>
+          </w:tcPr>
+          <w:p>
+            <w:r>
+              <w:rPr>
+                <w:rFonts w:ascii="Arial" w:cs="Arial" w:eastAsia="Arial" w:hAnsi="Arial"/>
+                <w:b w:val="false"/>
+                <w:bCs w:val="false"/>
+                <w:i w:val="false"/>
+                <w:iCs w:val="false"/>
+                <w:sz w:val="20"/>
+                <w:szCs w:val="20"/>
+              </w:rPr>
+              <w:t xml:space="preserve">No</w:t>
+            </w:r>
+          </w:p>
+        </w:tc>
+        <w:tc>
+          <w:tcPr>
+            <w:tcW w:type="dxa" w:w="900"/>
+            <w:tcBorders>
+              <w:top w:val="single" w:color="AAAAAA" w:sz="1"/>
+              <w:left w:val="single" w:color="AAAAAA" w:sz="1"/>
+              <w:bottom w:val="single" w:color="AAAAAA" w:sz="1"/>
+              <w:right w:val="single" w:color="AAAAAA" w:sz="1"/>
+            </w:tcBorders>
+            <w:shd w:fill="F2F7FB" w:val="clear"/>
+            <w:tcMar>
+              <w:top w:type="dxa" w:w="60"/>
+              <w:left w:type="dxa" w:w="100"/>
+              <w:bottom w:type="dxa" w:w="60"/>
+              <w:right w:type="dxa" w:w="100"/>
+            </w:tcMar>
+          </w:tcPr>
+          <w:p>
+            <w:r>
+              <w:rPr>
+                <w:rFonts w:ascii="Arial" w:cs="Arial" w:eastAsia="Arial" w:hAnsi="Arial"/>
+                <w:b w:val="false"/>
+                <w:bCs w:val="false"/>
+                <w:i w:val="false"/>
+                <w:iCs w:val="false"/>
+                <w:sz w:val="20"/>
+                <w:szCs w:val="20"/>
+              </w:rPr>
+              <w:t xml:space="preserve">—</w:t>
+            </w:r>
+          </w:p>
+        </w:tc>
+        <w:tc>
+          <w:tcPr>
+            <w:tcW w:type="dxa" w:w="2550"/>
+            <w:tcBorders>
+              <w:top w:val="single" w:color="AAAAAA" w:sz="1"/>
+              <w:left w:val="single" w:color="AAAAAA" w:sz="1"/>
+              <w:bottom w:val="single" w:color="AAAAAA" w:sz="1"/>
+              <w:right w:val="single" w:color="AAAAAA" w:sz="1"/>
+            </w:tcBorders>
+            <w:shd w:fill="F2F7FB" w:val="clear"/>
+            <w:tcMar>
+              <w:top w:type="dxa" w:w="60"/>
+              <w:left w:type="dxa" w:w="100"/>
+              <w:bottom w:type="dxa" w:w="60"/>
+              <w:right w:type="dxa" w:w="100"/>
+            </w:tcMar>
+          </w:tcPr>
+          <w:p>
+            <w:r>
+              <w:rPr>
+                <w:rFonts w:ascii="Arial" w:cs="Arial" w:eastAsia="Arial" w:hAnsi="Arial"/>
+                <w:b w:val="false"/>
+                <w:bCs w:val="false"/>
+                <w:i w:val="false"/>
+                <w:iCs w:val="false"/>
+                <w:sz w:val="20"/>
+                <w:szCs w:val="20"/>
+              </w:rPr>
+              <w:t xml:space="preserve">CR-EVENTS-MANAGE-DAT-055</w:t>
+            </w:r>
+          </w:p>
+        </w:tc>
+        <w:tc>
+          <w:tcPr>
+            <w:tcW w:type="dxa" w:w="2860"/>
+            <w:tcBorders>
+              <w:top w:val="single" w:color="AAAAAA" w:sz="1"/>
+              <w:left w:val="single" w:color="AAAAAA" w:sz="1"/>
+              <w:bottom w:val="single" w:color="AAAAAA" w:sz="1"/>
+              <w:right w:val="single" w:color="AAAAAA" w:sz="1"/>
+            </w:tcBorders>
+            <w:shd w:fill="F2F7FB" w:val="clear"/>
+            <w:tcMar>
+              <w:top w:type="dxa" w:w="60"/>
+              <w:left w:type="dxa" w:w="100"/>
+              <w:bottom w:type="dxa" w:w="60"/>
+              <w:right w:type="dxa" w:w="100"/>
+            </w:tcMar>
+          </w:tcPr>
+          <w:p>
+            <w:r>
+              <w:rPr>
+                <w:rFonts w:ascii="Arial" w:cs="Arial" w:eastAsia="Arial" w:hAnsi="Arial"/>
+                <w:b w:val="false"/>
+                <w:bCs w:val="false"/>
+                <w:i w:val="false"/>
+                <w:iCs w:val="false"/>
+                <w:sz w:val="20"/>
+                <w:szCs w:val="20"/>
+              </w:rPr>
+              <w:t xml:space="preserve">Timestamp set automatically the first time the event is listed publicly. Read-only and system-maintained. Retained if the event is later unlisted, so it records the first-publication time rather than current listing state.</w:t>
+            </w:r>
+          </w:p>
+        </w:tc>
+      </w:tr>
+    </w:tbl>
+    <w:p/>
+    <w:p>
+      <w:pPr>
         <w:pStyle w:val="Heading1"/>
         <w:spacing w:after="120" w:before="360"/>
       </w:pPr>
@@ -11546,6 +12177,138 @@
           </w:p>
         </w:tc>
       </w:tr>
+      <w:tr>
+        <w:tc>
+          <w:tcPr>
+            <w:tcW w:type="dxa" w:w="1500"/>
+            <w:tcBorders>
+              <w:top w:val="single" w:color="AAAAAA" w:sz="1"/>
+              <w:left w:val="single" w:color="AAAAAA" w:sz="1"/>
+              <w:bottom w:val="single" w:color="AAAAAA" w:sz="1"/>
+              <w:right w:val="single" w:color="AAAAAA" w:sz="1"/>
+            </w:tcBorders>
+            <w:shd w:fill="F2F7FB" w:val="clear"/>
+            <w:tcMar>
+              <w:top w:type="dxa" w:w="60"/>
+              <w:left w:type="dxa" w:w="100"/>
+              <w:bottom w:type="dxa" w:w="60"/>
+              <w:right w:type="dxa" w:w="100"/>
+            </w:tcMar>
+          </w:tcPr>
+          <w:p>
+            <w:r>
+              <w:rPr>
+                <w:rFonts w:ascii="Arial" w:cs="Arial" w:eastAsia="Arial" w:hAnsi="Arial"/>
+                <w:b/>
+                <w:bCs/>
+                <w:i w:val="false"/>
+                <w:iCs w:val="false"/>
+                <w:sz w:val="20"/>
+                <w:szCs w:val="20"/>
+              </w:rPr>
+              <w:t xml:space="preserve">EVT-DEC-013</w:t>
+            </w:r>
+          </w:p>
+        </w:tc>
+        <w:tc>
+          <w:tcPr>
+            <w:tcW w:type="dxa" w:w="7860"/>
+            <w:tcBorders>
+              <w:top w:val="single" w:color="AAAAAA" w:sz="1"/>
+              <w:left w:val="single" w:color="AAAAAA" w:sz="1"/>
+              <w:bottom w:val="single" w:color="AAAAAA" w:sz="1"/>
+              <w:right w:val="single" w:color="AAAAAA" w:sz="1"/>
+            </w:tcBorders>
+            <w:shd w:fill="F2F7FB" w:val="clear"/>
+            <w:tcMar>
+              <w:top w:type="dxa" w:w="60"/>
+              <w:left w:type="dxa" w:w="100"/>
+              <w:bottom w:type="dxa" w:w="60"/>
+              <w:right w:type="dxa" w:w="100"/>
+            </w:tcMar>
+          </w:tcPr>
+          <w:p>
+            <w:r>
+              <w:rPr>
+                <w:rFonts w:ascii="Arial" w:cs="Arial" w:eastAsia="Arial" w:hAnsi="Arial"/>
+                <w:b w:val="false"/>
+                <w:bCs w:val="false"/>
+                <w:i w:val="false"/>
+                <w:iCs w:val="false"/>
+                <w:sz w:val="20"/>
+                <w:szCs w:val="20"/>
+              </w:rPr>
+              <w:t xml:space="preserve">Public listing is governed by a dedicated, reversible flag (listedPublicly) that is separate from the Scheduled status. An event can be Scheduled without being listed, and listing can be withdrawn without changing status; publishedAt records the first-publication time and is system-set. Rationale: listing is an editorial decision distinct from the operational lifecycle, so decoupling them lets an event be prepared and scheduled before it is advertised.</w:t>
+            </w:r>
+          </w:p>
+        </w:tc>
+      </w:tr>
+      <w:tr>
+        <w:tc>
+          <w:tcPr>
+            <w:tcW w:type="dxa" w:w="1500"/>
+            <w:tcBorders>
+              <w:top w:val="single" w:color="AAAAAA" w:sz="1"/>
+              <w:left w:val="single" w:color="AAAAAA" w:sz="1"/>
+              <w:bottom w:val="single" w:color="AAAAAA" w:sz="1"/>
+              <w:right w:val="single" w:color="AAAAAA" w:sz="1"/>
+            </w:tcBorders>
+            <w:shd w:fill="F2F7FB" w:val="clear"/>
+            <w:tcMar>
+              <w:top w:type="dxa" w:w="60"/>
+              <w:left w:type="dxa" w:w="100"/>
+              <w:bottom w:type="dxa" w:w="60"/>
+              <w:right w:type="dxa" w:w="100"/>
+            </w:tcMar>
+          </w:tcPr>
+          <w:p>
+            <w:r>
+              <w:rPr>
+                <w:rFonts w:ascii="Arial" w:cs="Arial" w:eastAsia="Arial" w:hAnsi="Arial"/>
+                <w:b/>
+                <w:bCs/>
+                <w:i w:val="false"/>
+                <w:iCs w:val="false"/>
+                <w:sz w:val="20"/>
+                <w:szCs w:val="20"/>
+              </w:rPr>
+              <w:t xml:space="preserve">EVT-DEC-014</w:t>
+            </w:r>
+          </w:p>
+        </w:tc>
+        <w:tc>
+          <w:tcPr>
+            <w:tcW w:type="dxa" w:w="7860"/>
+            <w:tcBorders>
+              <w:top w:val="single" w:color="AAAAAA" w:sz="1"/>
+              <w:left w:val="single" w:color="AAAAAA" w:sz="1"/>
+              <w:bottom w:val="single" w:color="AAAAAA" w:sz="1"/>
+              <w:right w:val="single" w:color="AAAAAA" w:sz="1"/>
+            </w:tcBorders>
+            <w:shd w:fill="F2F7FB" w:val="clear"/>
+            <w:tcMar>
+              <w:top w:type="dxa" w:w="60"/>
+              <w:left w:type="dxa" w:w="100"/>
+              <w:bottom w:type="dxa" w:w="60"/>
+              <w:right w:type="dxa" w:w="100"/>
+            </w:tcMar>
+          </w:tcPr>
+          <w:p>
+            <w:r>
+              <w:rPr>
+                <w:rFonts w:ascii="Arial" w:cs="Arial" w:eastAsia="Arial" w:hAnsi="Arial"/>
+                <w:b w:val="false"/>
+                <w:bCs w:val="false"/>
+                <w:i w:val="false"/>
+                <w:iCs w:val="false"/>
+                <w:sz w:val="20"/>
+                <w:szCs w:val="20"/>
+              </w:rPr>
+              <w:t xml:space="preserve">An event appears on the public list only when listedPublicly is true, status is Scheduled, and the event has not yet started; the list is ordered soonest-first and an event drops off at its start time. The system unlists an event automatically on transition to Cancelled or Postponed. Rationale: the public list is a forward-looking view of upcoming events; existing registration rules are unchanged and continue to govern whether a listed event can be registered for.</w:t>
+            </w:r>
+          </w:p>
+        </w:tc>
+      </w:tr>
     </w:tbl>
     <w:p>
       <w:pPr>
@@ -11677,6 +12440,104 @@
                 <w:szCs w:val="20"/>
               </w:rPr>
               <w:t xml:space="preserve">Summary of Changes</w:t>
+            </w:r>
+          </w:p>
+        </w:tc>
+      </w:tr>
+      <w:tr>
+        <w:tc>
+          <w:tcPr>
+            <w:tcW w:type="dxa" w:w="1300"/>
+            <w:tcBorders>
+              <w:top w:val="single" w:color="AAAAAA" w:sz="1"/>
+              <w:left w:val="single" w:color="AAAAAA" w:sz="1"/>
+              <w:bottom w:val="single" w:color="AAAAAA" w:sz="1"/>
+              <w:right w:val="single" w:color="AAAAAA" w:sz="1"/>
+            </w:tcBorders>
+            <w:shd w:fill="F2F7FB" w:val="clear"/>
+            <w:tcMar>
+              <w:top w:type="dxa" w:w="60"/>
+              <w:left w:type="dxa" w:w="100"/>
+              <w:bottom w:type="dxa" w:w="60"/>
+              <w:right w:type="dxa" w:w="100"/>
+            </w:tcMar>
+          </w:tcPr>
+          <w:p>
+            <w:r>
+              <w:rPr>
+                <w:rFonts w:ascii="Arial" w:cs="Arial" w:eastAsia="Arial" w:hAnsi="Arial"/>
+                <w:b/>
+                <w:bCs/>
+                <w:i w:val="false"/>
+                <w:iCs w:val="false"/>
+                <w:sz w:val="20"/>
+                <w:szCs w:val="20"/>
+              </w:rPr>
+              <w:t xml:space="preserve">1.3</w:t>
+            </w:r>
+          </w:p>
+        </w:tc>
+        <w:tc>
+          <w:tcPr>
+            <w:tcW w:type="dxa" w:w="1900"/>
+            <w:tcBorders>
+              <w:top w:val="single" w:color="AAAAAA" w:sz="1"/>
+              <w:left w:val="single" w:color="AAAAAA" w:sz="1"/>
+              <w:bottom w:val="single" w:color="AAAAAA" w:sz="1"/>
+              <w:right w:val="single" w:color="AAAAAA" w:sz="1"/>
+            </w:tcBorders>
+            <w:shd w:fill="F2F7FB" w:val="clear"/>
+            <w:tcMar>
+              <w:top w:type="dxa" w:w="60"/>
+              <w:left w:type="dxa" w:w="100"/>
+              <w:bottom w:type="dxa" w:w="60"/>
+              <w:right w:type="dxa" w:w="100"/>
+            </w:tcMar>
+          </w:tcPr>
+          <w:p>
+            <w:r>
+              <w:rPr>
+                <w:rFonts w:ascii="Arial" w:cs="Arial" w:eastAsia="Arial" w:hAnsi="Arial"/>
+                <w:b w:val="false"/>
+                <w:bCs w:val="false"/>
+                <w:i w:val="false"/>
+                <w:iCs w:val="false"/>
+                <w:sz w:val="20"/>
+                <w:szCs w:val="20"/>
+              </w:rPr>
+              <w:t xml:space="preserve">05-29-26 16:30</w:t>
+            </w:r>
+          </w:p>
+        </w:tc>
+        <w:tc>
+          <w:tcPr>
+            <w:tcW w:type="dxa" w:w="6160"/>
+            <w:tcBorders>
+              <w:top w:val="single" w:color="AAAAAA" w:sz="1"/>
+              <w:left w:val="single" w:color="AAAAAA" w:sz="1"/>
+              <w:bottom w:val="single" w:color="AAAAAA" w:sz="1"/>
+              <w:right w:val="single" w:color="AAAAAA" w:sz="1"/>
+            </w:tcBorders>
+            <w:shd w:fill="F2F7FB" w:val="clear"/>
+            <w:tcMar>
+              <w:top w:type="dxa" w:w="60"/>
+              <w:left w:type="dxa" w:w="100"/>
+              <w:bottom w:type="dxa" w:w="60"/>
+              <w:right w:type="dxa" w:w="100"/>
+            </w:tcMar>
+          </w:tcPr>
+          <w:p>
+            <w:r>
+              <w:rPr>
+                <w:rFonts w:ascii="Arial" w:cs="Arial" w:eastAsia="Arial" w:hAnsi="Arial"/>
+                <w:b w:val="false"/>
+                <w:bCs w:val="false"/>
+                <w:i w:val="false"/>
+                <w:iCs w:val="false"/>
+                <w:sz w:val="20"/>
+                <w:szCs w:val="20"/>
+              </w:rPr>
+              <w:t xml:space="preserve">Added public-listing fields listedPublicly (DAT-054) and publishedAt (DAT-055) in new Section 3.6 Publishing Fields, supporting the public events list hosted in the custom web application. Re-defined recordingUrl (DAT-030) as the raw-source reference to the unedited recording — auto-populated by the virtual meeting platform integration when available, manual entry otherwise, editable, visible for all formats — with the edited published copy held on a separate Resource record. Removed recordingUrl from the format field driven-visibility list. Added EVT-DEC-013 and EVT-DEC-014.</w:t>
             </w:r>
           </w:p>
         </w:tc>

</xml_diff>